<commit_message>
Clarify being human in the personal sense across five translations
</commit_message>
<xml_diff>
--- a/docs/exposition/downloads/CTM_analysis_en.docx
+++ b/docs/exposition/downloads/CTM_analysis_en.docx
@@ -427,18 +427,54 @@
     </w:p>
     <w:p>
       <w:r>
+        <w:t>CTM connects this claim with the fullness of being human. Christ does not come to secure the human being's place as an obedient component of an existing order. A relationship with Christ should transform the person's capacity to see, understand, communicate, act, and remain themselves in the face of death. The project therefore approaches faith as a mode of being and ecclesial life as the space in which that mode of being takes shape. [I, introduction to “An Essay in the Applied Metaphysics of the Subject”; “The Starting Point: Once the Original”; “The Function of the Church”.]</w:t>
+      </w:r>
+    </w:p>
+    <w:p>
+      <w:pPr>
+        <w:pStyle w:val="Heading2"/>
+      </w:pPr>
+      <w:r>
+        <w:t>Why the question of the Church's function is theological</w:t>
+      </w:r>
+    </w:p>
+    <w:p>
+      <w:r>
         <w:rPr>
           <w:b w:val="0"/>
         </w:rPr>
-        <w:t>CTM connects this claim with the fullness of humanity. Christ does not come to secure the human being's place as an obedient component of an existing order. A relationship with Christ should transform the person's capacity to see, understand, communicate, act, and remain themselves in the face of death. The project therefore approaches faith as a mode of being and ecclesial life as the space in which that mode of being takes shape. [I, introduction to “An Essay in the Applied Metaphysics of the Subject”; “The Starting Point: Once the Original”; “The Function of the Church”.]</w:t>
-      </w:r>
+        <w:t>CTM could mistakenly be read as proposing that the Church be assessed by the standards of a business: how many people attended, how many services were provided, and how satisfied the participants were. The author's question is different. If God the Logos is confessed as the principal acting Person in the Church's sacraments, what does this mean for human life? How does participation in a sacrament relate to the development of the human being's logos-bearing nature?</w:t>
+      </w:r>
+    </w:p>
+    <w:p>
+      <w:r>
+        <w:t>The functional question belongs within theology. It requires tracing the connection between what is confessed and the fruits of ecclesial life. A person may know the correct formulas yet be unable to distinguish truth from their own fear. They may be a disciplined parishioner yet transfer responsibility for everything that happens to a spiritual director. They may speak of communion yet encounter only confirmation of their own picture of the world. These discrepancies are precisely what the inquiry examines.</w:t>
+      </w:r>
+    </w:p>
+    <w:p>
+      <w:r>
+        <w:rPr>
+          <w:b w:val="0"/>
+        </w:rPr>
+        <w:t>Observing human outcomes does not, however, give the researcher direct access to the action of grace. The method can establish that a particular arrangement of leadership blocks a response of one's own. It cannot use this finding to pass an exhaustive judgement on the mystery of the Church or a person's ultimate destiny. This limitation is formulated especially clearly in Volume III. [III, Part XIII; “In Search of Pneumatology”, §§16–17.]</w:t>
+      </w:r>
+    </w:p>
+    <w:p>
+      <w:bookmarkStart w:id="2" w:name="section_2"/>
+      <w:pPr>
+        <w:pStyle w:val="Heading1"/>
+      </w:pPr>
+      <w:r>
+        <w:t>2 Reality and the Human Map</w:t>
+      </w:r>
+      <w:bookmarkEnd w:id="2"/>
     </w:p>
     <w:p>
       <w:pPr>
         <w:pStyle w:val="Heading2"/>
       </w:pPr>
       <w:r>
-        <w:t>Why the question of the Church's function is theological</w:t>
+        <w:t>Reality precedes the human being</w:t>
       </w:r>
     </w:p>
     <w:p>
@@ -446,12 +482,7 @@
         <w:rPr>
           <w:b w:val="0"/>
         </w:rPr>
-        <w:t>CTM could mistakenly be read as proposing that the Church be assessed by the standards of a business: how many people attended, how many services were provided, and how satisfied the participants were. The author's question is different. If God the Logos is confessed as the principal acting Person in the Church's sacraments, what does this mean for human life? How does participation in a sacrament relate to the development of the human being's logos-bearing nature?</w:t>
-      </w:r>
-    </w:p>
-    <w:p>
-      <w:r>
-        <w:t>The functional question belongs within theology. It requires tracing the connection between what is confessed and the fruits of ecclesial life. A person may know the correct formulas yet be unable to distinguish truth from their own fear. They may be a disciplined parishioner yet transfer responsibility for everything that happens to a spiritual director. They may speak of communion yet encounter only confirmation of their own picture of the world. These discrepancies are precisely what the inquiry examines.</w:t>
+        <w:t>CTM's first philosophical proposition is that the human being discovers themselves within an already existing reality. Their body, history, relationships, language, and possibilities are not originally their own creation. They enter a world that resists their wishes and can disprove their representations. This is the project's initial realism.</w:t>
       </w:r>
     </w:p>
     <w:p>
@@ -459,25 +490,94 @@
         <w:rPr>
           <w:b w:val="0"/>
         </w:rPr>
-        <w:t>Observing human outcomes does not, however, give the researcher direct access to the action of grace. The method can establish that a particular arrangement of leadership blocks a response of one's own. It cannot use this finding to pass an exhaustive judgement on the mystery of the Church or a person's ultimate destiny. This limitation is formulated especially clearly in Volume III. [III, Part XIII; “In Search of Pneumatology”, §§16–17.]</w:t>
-      </w:r>
-    </w:p>
-    <w:p>
-      <w:bookmarkStart w:id="2" w:name="section_2"/>
+        <w:t>Yet the independence of Reality does not imply that a person sees it directly and completely. Between reality and action stands the picture of the world that the person has acquired. Two people may know the same set of facts yet inhabit different worlds: one sees criticism as an opportunity for correction, the other as an attack on their right to exist. What differs is not simply an opinion about a fact, but the distribution of what is significant, dangerous, permissible, and possible.</w:t>
+      </w:r>
+    </w:p>
+    <w:p>
+      <w:r>
+        <w:rPr>
+          <w:b w:val="0"/>
+        </w:rPr>
+        <w:t>CTM therefore distinguishes Reality from the map. A map is necessary: meaningful action is impossible without selection, differentiation, and connection. Danger arises when the map declares itself the definitive whole and ceases to receive information about its own limitations. Error then becomes a way of life. The person defends not an isolated false judgement but an arrangement of the world that allows them to remain who they take themselves to be. [I, “Essay”, ch. 1; III, Part II.]</w:t>
+      </w:r>
+    </w:p>
+    <w:p>
+      <w:pPr>
+        <w:pStyle w:val="Heading2"/>
+      </w:pPr>
+      <w:r>
+        <w:t>Truth as a relationship and as verification</w:t>
+      </w:r>
+    </w:p>
+    <w:p>
+      <w:r>
+        <w:rPr>
+          <w:b w:val="0"/>
+        </w:rPr>
+        <w:t>Volume I describes truth through the acknowledgement of Reality. The distinction is between “I know that this happened” and “I am willing to build my subsequent life in the light of what happened”. A person may acknowledge defeat in conversation while continuing to make decisions as though no defeat had occurred. Knowledge has not yet become a ground for action.</w:t>
+      </w:r>
+    </w:p>
+    <w:p>
+      <w:r>
+        <w:t>This broadens the question of truth without dispensing with the accuracy of statements. If the facts are wrong, willingness to live “according to truth” may mean no more than consistently following an error. On the interpretation proposed here, CTM therefore combines the verifiability of judgements with an existential willingness to accept their consequences. In Volume III, this combination is protected by the requirement to distinguish fact, interpretation, norm, project, and forecast.</w:t>
+      </w:r>
+    </w:p>
+    <w:p>
+      <w:r>
+        <w:rPr>
+          <w:b w:val="0"/>
+        </w:rPr>
+        <w:t>The concept of discrepancy information belongs here. This is information that reveals a gap between reality and the operative model, between the scale of a task and the capacities of an instrument, or between a declared function and its result. It does not always supply a ready-made solution. Sometimes its only reliable content is that the previous way of acting can no longer be considered justified.</w:t>
+      </w:r>
+    </w:p>
+    <w:p>
+      <w:pPr>
+        <w:pStyle w:val="Heading2"/>
+      </w:pPr>
+      <w:r>
+        <w:t>Metaphysics and operative ontology</w:t>
+      </w:r>
+    </w:p>
+    <w:p>
+      <w:r>
+        <w:rPr>
+          <w:b w:val="0"/>
+        </w:rPr>
+        <w:t>In CTM's vocabulary, metaphysics establishes ultimate presuppositions: what is ultimately real, where meaning comes from, and what grounds the binding force of truth. Operative ontology shows how these presuppositions are embodied in the subject's actual world: what the subject distinguishes, what actions they can perform, and to whom initiative belongs.</w:t>
+      </w:r>
+    </w:p>
+    <w:p>
+      <w:r>
+        <w:rPr>
+          <w:b w:val="0"/>
+        </w:rPr>
+        <w:t>For example, an organisation proclaims the value of the human being, but its reporting records only the number of operations performed. Its formally declared metaphysics diverges from the ontology it actually reproduces. In everyday action, the human being appears as a unit to be processed. Repeating the declaration is not enough to change this situation. Ways of seeing, deciding, evaluating, and taking responsibility must change.</w:t>
+      </w:r>
+    </w:p>
+    <w:p>
+      <w:r>
+        <w:rPr>
+          <w:b w:val="0"/>
+        </w:rPr>
+        <w:t>Applied metaphysics examines such connections. It makes presuppositions visible, tests their consequences, and opens them to revision. It does not promise to eliminate every presupposition once and for all: the researcher also works through a map. A mature method must therefore permit the correction of its own reconstruction. [I, “Essay”, introduction and ch. 5; III, §§112–114, 132–134.]</w:t>
+      </w:r>
+    </w:p>
+    <w:p>
+      <w:bookmarkStart w:id="3" w:name="section_3"/>
       <w:pPr>
         <w:pStyle w:val="Heading1"/>
       </w:pPr>
       <w:r>
-        <w:t>2 Reality and the Human Map</w:t>
-      </w:r>
-      <w:bookmarkEnd w:id="2"/>
+        <w:t>3 Derivative Existence and a Response of One's Own</w:t>
+      </w:r>
+      <w:bookmarkEnd w:id="3"/>
     </w:p>
     <w:p>
       <w:pPr>
         <w:pStyle w:val="Heading2"/>
       </w:pPr>
       <w:r>
-        <w:t>Reality precedes the human being</w:t>
+        <w:t>Three meanings of dependence</w:t>
       </w:r>
     </w:p>
     <w:p>
@@ -485,7 +585,7 @@
         <w:rPr>
           <w:b w:val="0"/>
         </w:rPr>
-        <w:t>CTM's first philosophical proposition is that the human being discovers themselves within an already existing reality. Their body, history, relationships, language, and possibilities are not originally their own creation. They enter a world that resists their wishes and can disprove their representations. This is the project's initial realism.</w:t>
+        <w:t>The project's central question can be formulated as follows: how does a being whose existence has already been initiated become one who initiates? A person does not choose the initial conditions of their emergence. But it does not follow that their entire subsequent life must be understood exclusively as a continuation of external influences.</w:t>
       </w:r>
     </w:p>
     <w:p>
@@ -493,7 +593,7 @@
         <w:rPr>
           <w:b w:val="0"/>
         </w:rPr>
-        <w:t>Yet the independence of Reality does not imply that a person sees it directly and completely. Between reality and action stands the picture of the world that the person has acquired. Two people may know the same set of facts yet inhabit different worlds: one sees criticism as an opportunity for correction, the other as an attack on their right to exist. What differs is not simply an opinion about a fact, but the distribution of what is significant, dangerous, permissible, and possible.</w:t>
+        <w:t>Three relations must be distinguished here. The first is the received character of existence itself. Neither freedom, maturity, nor deification abolishes it. The second is the reproduction of others' attitudes without personally accepting and examining them. It is this lack of independence that the project seeks to overcome. The third is a response of one's own within the continuing received character of existence: the person accepts what is given without treating it as the exhaustive author of their next action.</w:t>
       </w:r>
     </w:p>
     <w:p>
@@ -501,7 +601,7 @@
         <w:rPr>
           <w:b w:val="0"/>
         </w:rPr>
-        <w:t>CTM therefore distinguishes Reality from the map. A map is necessary: meaningful action is impossible without selection, differentiation, and connection. Danger arises when the map declares itself the definitive whole and ceases to receive information about its own limitations. Error then becomes a way of life. The person defends not an isolated false judgement but an arrangement of the world that allows them to remain who they take themselves to be. [I, “Essay”, ch. 1; III, Part II.]</w:t>
+        <w:t>Accepting one's beginning does not mean approving the violence, injustice, or error that may belong to its history. Acceptance establishes the reality with which the person has to deal. Responsibility begins where they determine what now depends on their response. It is not a retrospective assumption of guilt for everything they did not choose. [II, “The Genesis of Subjecthood”, §§5.1–5.2; “The Ontogenesis of Subjecthood”, §§2–5.]</w:t>
       </w:r>
     </w:p>
     <w:p>
@@ -509,7 +609,7 @@
         <w:pStyle w:val="Heading2"/>
       </w:pPr>
       <w:r>
-        <w:t>Truth as a relationship and as verification</w:t>
+        <w:t>Response precedes choice</w:t>
       </w:r>
     </w:p>
     <w:p>
@@ -517,12 +617,7 @@
         <w:rPr>
           <w:b w:val="0"/>
         </w:rPr>
-        <w:t>Volume I describes truth through the acknowledgement of Reality. The distinction is between “I know that this happened” and “I am willing to build my subsequent life in the light of what happened”. A person may acknowledge defeat in conversation while continuing to make decisions as though no defeat had occurred. Knowledge has not yet become a ground for action.</w:t>
-      </w:r>
-    </w:p>
-    <w:p>
-      <w:r>
-        <w:t>This broadens the question of truth without dispensing with the accuracy of statements. If the facts are wrong, willingness to live “according to truth” may mean no more than consistently following an error. On the interpretation proposed here, CTM therefore combines the verifiability of judgements with an existential willingness to accept their consequences. In Volume III, this combination is protected by the requirement to distinguish fact, interpretation, norm, project, and forecast.</w:t>
+        <w:t>The usual model of freedom begins with a menu of possibilities: a person is free if they can choose between A and B. CTM redirects attention to the origin of the menu itself. Who determined that only A and B were possible? Who excluded other options? Can the person change the way the question is posed?</w:t>
       </w:r>
     </w:p>
     <w:p>
@@ -530,7 +625,15 @@
         <w:rPr>
           <w:b w:val="0"/>
         </w:rPr>
-        <w:t>The concept of discrepancy information belongs here. This is information that reveals a gap between reality and the operative model, between the scale of a task and the capacities of an instrument, or between a declared function and its result. It does not always supply a ready-made solution. Sometimes its only reliable content is that the previous way of acting can no longer be considered justified.</w:t>
+        <w:t>A doctor choosing between two permitted procedures makes a real choice. But if neither procedure addresses the patient's condition, another capacity is required: to question the operative classification and secure its revision. This illustrates the difference between a choice within a given space and a response that changes the space of possibilities.</w:t>
+      </w:r>
+    </w:p>
+    <w:p>
+      <w:r>
+        <w:rPr>
+          <w:b w:val="0"/>
+        </w:rPr>
+        <w:t>Response does not mean arbitrary novelty. An unusual act may be accidental, while repeating a known solution may be a responsible action of one's own. What matters is authorship of one's relation to the situation, acceptance of consequences, and the capacity for correction. A person responds not because they invented everything from nothing, but because they have appropriated the decision as their own and remain its responsible bearer.</w:t>
       </w:r>
     </w:p>
     <w:p>
@@ -538,7 +641,7 @@
         <w:pStyle w:val="Heading2"/>
       </w:pPr>
       <w:r>
-        <w:t>Metaphysics and operative ontology</w:t>
+        <w:t>Subjecthood is not equivalent to virtue</w:t>
       </w:r>
     </w:p>
     <w:p>
@@ -546,7 +649,30 @@
         <w:rPr>
           <w:b w:val="0"/>
         </w:rPr>
-        <w:t>In CTM's vocabulary, metaphysics establishes ultimate presuppositions: what is ultimately real, where meaning comes from, and what grounds the binding force of truth. Operative ontology shows how these presuppositions are embodied in the subject's actual world: what the subject distinguishes, what actions they can perform, and to whom initiative belongs.</w:t>
+        <w:t>Volumes II–III distinguish subjecthood from the moral truth of a response. A person can independently initiate a destructive project. They may be intelligent, consistent, enterprising, and responsible in a limited sense while directing those capacities against others. The strength of authorship does not certify the rightness of its ground.</w:t>
+      </w:r>
+    </w:p>
+    <w:p>
+      <w:r>
+        <w:t>This distinction is also necessary for understanding the image of God. The possibility of responding does not automatically disappear when a response is false; otherwise responsibility for evil would become unintelligible. It is necessary to distinguish the possession of a capacity, its actual realisation, and the quality of its direction. At the same time, several formulations in Volume I use “subjecthood” in a stricter, normatively charged sense, as an already truthful relationship to Reality. This is a significant shift of emphasis, to which the critical part will return. [III, §§11–13, 125; II, “The Ontogenesis of Subjecthood”, §15.]</w:t>
+      </w:r>
+    </w:p>
+    <w:p>
+      <w:bookmarkStart w:id="4" w:name="section_4"/>
+      <w:pPr>
+        <w:pStyle w:val="Heading1"/>
+      </w:pPr>
+      <w:r>
+        <w:t>4 Autonomy and Ontological Readdressing</w:t>
+      </w:r>
+      <w:bookmarkEnd w:id="4"/>
+    </w:p>
+    <w:p>
+      <w:pPr>
+        <w:pStyle w:val="Heading2"/>
+      </w:pPr>
+      <w:r>
+        <w:t>Why a person needs independence</w:t>
       </w:r>
     </w:p>
     <w:p>
@@ -554,7 +680,7 @@
         <w:rPr>
           <w:b w:val="0"/>
         </w:rPr>
-        <w:t>For example, an organisation proclaims the value of the human being, but its reporting records only the number of operations performed. Its formally declared metaphysics diverges from the ontology it actually reproduces. In everyday action, the human being appears as a unit to be processed. Repeating the declaration is not enough to change this situation. Ways of seeing, deciding, evaluating, and taking responsibility must change.</w:t>
+        <w:t>In Volume I, the subject's formation passes through foundation, self-determination, the decolonisation of the person, and the development of autonomy. Foundation denotes the adoption of one's own position; decolonisation means liberation from attitudes that effectively think and decide on one's behalf. Autonomy enables the person to maintain a position under pressure and construct their own project of the future.</w:t>
       </w:r>
     </w:p>
     <w:p>
@@ -562,25 +688,97 @@
         <w:rPr>
           <w:b w:val="0"/>
         </w:rPr>
-        <w:t>Applied metaphysics examines such connections. It makes presuppositions visible, tests their consequences, and opens them to revision. It does not promise to eliminate every presupposition once and for all: the researcher also works through a map. A mature method must therefore permit the correction of its own reconstruction. [I, “Essay”, introduction and ch. 5; III, §§112–114, 132–134.]</w:t>
-      </w:r>
-    </w:p>
-    <w:p>
-      <w:bookmarkStart w:id="3" w:name="section_3"/>
+        <w:t>This stage cannot be replaced by an external command to “renounce yourself”. If a person cannot yet answer for themselves, renouncing independence may consolidate their dependence on another person or institution. That is why CTM persistently distinguishes Christian readdressing from totalitarian submission.</w:t>
+      </w:r>
+    </w:p>
+    <w:p>
+      <w:r>
+        <w:rPr>
+          <w:b w:val="0"/>
+        </w:rPr>
+        <w:t>However, Volume I takes independence to a radical limit: the subject must attempt to sustain a universal claim through their own powers and discover the impossibility of self-grounding. One cannot honestly recount this text while asserting that the requirement to pass through autonomy was entirely invented by a commentator. It is explicitly present in the “Essay” and in the model of ontological therapy. The question concerns the precise meaning of this autonomy. [I, “Essay”, ch. 2, §§2, 7, 9–11; “The Church as Infrastructure”, points 4–7.]</w:t>
+      </w:r>
+    </w:p>
+    <w:p>
+      <w:pPr>
+        <w:pStyle w:val="Heading2"/>
+      </w:pPr>
+      <w:r>
+        <w:t>The limit of self-grounding</w:t>
+      </w:r>
+    </w:p>
+    <w:p>
+      <w:r>
+        <w:rPr>
+          <w:b w:val="0"/>
+        </w:rPr>
+        <w:t>A person can author a project but cannot make themselves the cause of their own existence, abolish finitude, or guarantee the ultimate meaning of all the consequences. Expanding a project increases responsibility while revealing the disproportion between its claim and the powers available.</w:t>
+      </w:r>
+    </w:p>
+    <w:p>
+      <w:r>
+        <w:rPr>
+          <w:b w:val="0"/>
+        </w:rPr>
+        <w:t>This argument has a strong core: practical independence is not metaphysical self-sufficiency. Dependence on conditions does not imply that a person does not act; the reality of their action does not imply that they depend on nothing. CTM attempts to hold both sides together.</w:t>
+      </w:r>
+    </w:p>
+    <w:p>
+      <w:r>
+        <w:rPr>
+          <w:b w:val="0"/>
+        </w:rPr>
+        <w:t>Volume I's stronger proposition—that every subject must undergo an actual attempt at universal self-grounding—requires a separate justification. We may ask why a person cannot accept finitude and responsibility from the outset, without claiming absolute independence. Indeed, “The Genesis of Subjecthood” in Volume II begins with a hermeneutics of received existence and responsibility. A coherent reading of the corpus must therefore distinguish the necessary development of independence from a possible radical testing of its limit.</w:t>
+      </w:r>
+    </w:p>
+    <w:p>
+      <w:pPr>
+        <w:pStyle w:val="Heading2"/>
+      </w:pPr>
+      <w:r>
+        <w:t>What is readdressed</w:t>
+      </w:r>
+    </w:p>
+    <w:p>
+      <w:r>
+        <w:rPr>
+          <w:b w:val="0"/>
+        </w:rPr>
+        <w:t>Ontological readdressing means a change in the ultimate ground of life. The person ceases to treat their own preservation, desire, or historical success as an absolute criterion. Yet the decision remains their decision. They neither transfer responsibility to someone else nor acquire the right to justify any action by appealing to a higher will.</w:t>
+      </w:r>
+    </w:p>
+    <w:p>
+      <w:r>
+        <w:rPr>
+          <w:b w:val="0"/>
+        </w:rPr>
+        <w:t>In the Christian perspective, the addressee is God, revealed in Christ. Yet God's name may conceal an entirely different dependence. If the actual ultimate ground is a leader's infallibility, an institution's prestige, or a national victory, religious language does not by itself establish that life has been readdressed to God.</w:t>
+      </w:r>
+    </w:p>
+    <w:p>
+      <w:r>
+        <w:rPr>
+          <w:b w:val="0"/>
+        </w:rPr>
+        <w:t>The practical test concerns the possibility of correction: can the person acknowledge that their interpretation of God's will was mistaken? Do they retain responsibility for their own understanding? Can they acknowledge the reality of another person when that person obstructs their project? Readdressing that excludes such questions risks reproducing precisely the colonisation it should overcome.</w:t>
+      </w:r>
+    </w:p>
+    <w:p>
+      <w:bookmarkStart w:id="5" w:name="section_5"/>
       <w:pPr>
         <w:pStyle w:val="Heading1"/>
       </w:pPr>
       <w:r>
-        <w:t>3 Derivative Existence and a Response of One's Own</w:t>
-      </w:r>
-      <w:bookmarkEnd w:id="3"/>
+        <w:t>5 The Architecture of Human Response</w:t>
+      </w:r>
+      <w:bookmarkEnd w:id="5"/>
     </w:p>
     <w:p>
       <w:pPr>
         <w:pStyle w:val="Heading2"/>
       </w:pPr>
       <w:r>
-        <w:t>Three meanings of dependence</w:t>
+        <w:t>Dynamic Iconic Space</w:t>
       </w:r>
     </w:p>
     <w:p>
@@ -588,7 +786,7 @@
         <w:rPr>
           <w:b w:val="0"/>
         </w:rPr>
-        <w:t>The project's central question can be formulated as follows: how does a being whose existence has already been initiated become one who initiates? A person does not choose the initial conditions of their emergence. But it does not follow that their entire subsequent life must be understood exclusively as a continuation of external influences.</w:t>
+        <w:t>DIS is the way the world is present to a subject. It includes not only information about objects but also connections, significance, scale, time, threats, expectations, and images of what is possible. “Iconic” here is not reducible to a picture or an ecclesiastical icon: it concerns the representation of reality through which the subject orients themselves and acts.</w:t>
       </w:r>
     </w:p>
     <w:p>
@@ -596,7 +794,7 @@
         <w:rPr>
           <w:b w:val="0"/>
         </w:rPr>
-        <w:t>Three relations must be distinguished here. The first is the received character of existence itself. Neither freedom, maturity, nor deification abolishes it. The second is the reproduction of others' attitudes without personally accepting and examining them. It is this lack of independence that the project seeks to overcome. The third is a response of one's own within the continuing received character of existence: the person accepts what is given without treating it as the exhaustive author of their next action.</w:t>
+        <w:t>The quality of DIS is not determined by the quantity of knowledge alone. One can know many details without seeing the whole; think on vast historical scales without discerning a concrete person; or maintain a clear picture of the present while overlooking delayed consequences. What matters, therefore, is scope, resolution, connectedness, depth, dynamism, openness, and the ability to sustain a contradiction without hastily eliminating one of its sides.</w:t>
       </w:r>
     </w:p>
     <w:p>
@@ -604,7 +802,7 @@
         <w:rPr>
           <w:b w:val="0"/>
         </w:rPr>
-        <w:t>Accepting one's beginning does not mean approving the violence, injustice, or error that may belong to its history. Acceptance establishes the reality with which the person has to deal. Responsibility begins where they determine what now depends on their response. It is not a retrospective assumption of guilt for everything they did not choose. [II, “The Genesis of Subjecthood”, §§5.1–5.2; “The Ontogenesis of Subjecthood”, §§2–5.]</w:t>
+        <w:t>A person who treats a state budget as the ruler's personal purse is not simply mistaken about particular figures. The object itself, causality, and responsibility are represented differently. A change in DIS means that the budget becomes visible as a distributed system of obligations, revenues, expenditure, and future consequences. [II, “The Quality of Ontology”, §§1–3; III, §22 and Part IV.]</w:t>
       </w:r>
     </w:p>
     <w:p>
@@ -612,7 +810,7 @@
         <w:pStyle w:val="Heading2"/>
       </w:pPr>
       <w:r>
-        <w:t>Response precedes choice</w:t>
+        <w:t>Operating System</w:t>
       </w:r>
     </w:p>
     <w:p>
@@ -620,7 +818,7 @@
         <w:rPr>
           <w:b w:val="0"/>
         </w:rPr>
-        <w:t>The usual model of freedom begins with a menu of possibilities: a person is free if they can choose between A and B. CTM redirects attention to the origin of the menu itself. Who determined that only A and B were possible? Who excluded other options? Can the person change the way the question is posed?</w:t>
+        <w:t>OS is the set of ways of working with reality. CTM distinguishes receptive-interpretive, projective-executive, and reflexive-corrective circuits: how the subject receives and understands information; how they plan and carry out action; and how they assess consequences and correct themselves.</w:t>
       </w:r>
     </w:p>
     <w:p>
@@ -628,7 +826,7 @@
         <w:rPr>
           <w:b w:val="0"/>
         </w:rPr>
-        <w:t>A doctor choosing between two permitted procedures makes a real choice. But if neither procedure addresses the patient's condition, another capacity is required: to question the operative classification and secure its revision. This illustrates the difference between a choice within a given space and a response that changes the space of possibilities.</w:t>
+        <w:t>A person may see a problem without possessing an operation that enables them to solve it. An organisation may gather reliable information but lack a procedure for changing a decision after receiving it. The reverse situation is also possible: a procedure formally exists but is never activated in a particular class of situations. These cases require different explanations and different changes.</w:t>
       </w:r>
     </w:p>
     <w:p>
@@ -636,7 +834,7 @@
         <w:rPr>
           <w:b w:val="0"/>
         </w:rPr>
-        <w:t>Response does not mean arbitrary novelty. An unusual act may be accidental, while repeating a known solution may be a responsible action of one's own. What matters is authorship of one's relation to the situation, acceptance of consequences, and the capacity for correction. A person responds not because they invented everything from nothing, but because they have appropriated the decision as their own and remain its responsible bearer.</w:t>
+        <w:t>OS is not a hidden second subject inside the person. It is an analytical designation for the operations available to and used by them. Likewise, DIS does not “make decisions”: it is the whole person who sees, decides, and acts.</w:t>
       </w:r>
     </w:p>
     <w:p>
@@ -644,7 +842,7 @@
         <w:pStyle w:val="Heading2"/>
       </w:pPr>
       <w:r>
-        <w:t>Subjecthood is not equivalent to virtue</w:t>
+        <w:t>Subjecthood and the Scenario Book</w:t>
       </w:r>
     </w:p>
     <w:p>
@@ -652,30 +850,65 @@
         <w:rPr>
           <w:b w:val="0"/>
         </w:rPr>
-        <w:t>Volumes II–III distinguish subjecthood from the moral truth of a response. A person can independently initiate a destructive project. They may be intelligent, consistent, enterprising, and responsible in a limited sense while directing those capacities against others. The strength of authorship does not certify the rightness of its ground.</w:t>
-      </w:r>
-    </w:p>
-    <w:p>
-      <w:r>
-        <w:t>This distinction is also necessary for understanding the image of God. The possibility of responding does not automatically disappear when a response is false; otherwise responsibility for evil would become unintelligible. It is necessary to distinguish the possession of a capacity, its actual realisation, and the quality of its direction. At the same time, several formulations in Volume I use “subjecthood” in a stricter, normatively charged sense, as an already truthful relationship to Reality. This is a significant shift of emphasis, to which the critical part will return. [III, §§11–13, 125; II, “The Ontogenesis of Subjecthood”, §15.]</w:t>
-      </w:r>
-    </w:p>
-    <w:p>
-      <w:bookmarkStart w:id="4" w:name="section_4"/>
+        <w:t>The third dimension answers the question: who is the actual author of the response? Who has initiative and the right to object, correct, and stop? To whom do consequences return? In a complex system, these powers may be distributed. The absence of a single centre does not in itself mean the absence of subjecthood; one must determine whether the distributed functions form a connected circuit.</w:t>
+      </w:r>
+    </w:p>
+    <w:p>
+      <w:r>
+        <w:rPr>
+          <w:b w:val="0"/>
+        </w:rPr>
+        <w:t>The formula “DIS × OS × subjecthood” expresses the interdependence of these dimensions. It is not a calculation with known units and coefficients. A rich picture of the world does not ensure the capacity to act; developed operations do not ensure authorship of one's own; strong initiative does not compensate for blindness.</w:t>
+      </w:r>
+    </w:p>
+    <w:p>
+      <w:r>
+        <w:rPr>
+          <w:b w:val="0"/>
+        </w:rPr>
+        <w:t>The Scenario Book denotes stable rules connecting these dimensions in a particular situation. For example, an institution knows how to revise decisions but recognises any public criticism as a threat. The available operation of correction is then systematically blocked specifically in situations of criticism. To demonstrate the existence of such a rule, one episode is insufficient: comparable cases or independent corroboration are required. [III, §22a, §§113a, 118a.]</w:t>
+      </w:r>
+    </w:p>
+    <w:p>
+      <w:pPr>
+        <w:pStyle w:val="Heading2"/>
+      </w:pPr>
+      <w:r>
+        <w:t>The quality of ontology and ontological competence</w:t>
+      </w:r>
+    </w:p>
+    <w:p>
+      <w:r>
+        <w:rPr>
+          <w:b w:val="0"/>
+        </w:rPr>
+        <w:t>The quality of ontology characterises the organisation of the subject's operative world. Ontological competence is the subject's capacity to orient themselves within that world, recognise the limitations of their own map, coordinate the necessary knowledge and ways of acting, withstand discrepancy, and produce a response.</w:t>
+      </w:r>
+    </w:p>
+    <w:p>
+      <w:r>
+        <w:rPr>
+          <w:b w:val="0"/>
+        </w:rPr>
+        <w:t>This distinction protects the project against intellectualism. An extensive theory does not guarantee the capacity to act, and clear understanding does not guarantee implementation of a project. Competence includes a relationship to one's own limits: finding a specialist, acknowledging insufficient data, or stopping an inapplicable method is sometimes more important than offering another explanation. Groundedness and the ordering of values run through the entire architecture: for what purpose are capacities used, and what is sacrificed when goods conflict? [II, “The Quality of Ontology”, §§4–9; III, §§32–36.]</w:t>
+      </w:r>
+    </w:p>
+    <w:p>
+      <w:bookmarkStart w:id="6" w:name="section_6"/>
       <w:pPr>
         <w:pStyle w:val="Heading1"/>
       </w:pPr>
       <w:r>
-        <w:t>4 Autonomy and Ontological Readdressing</w:t>
-      </w:r>
-      <w:bookmarkEnd w:id="4"/>
+        <w:t>6 Personal Formation and Historical Action</w:t>
+      </w:r>
+      <w:bookmarkEnd w:id="6"/>
     </w:p>
     <w:p>
       <w:pPr>
         <w:pStyle w:val="Heading2"/>
       </w:pPr>
       <w:r>
-        <w:t>Why a person needs independence</w:t>
+        <w:t>From accepting one's beginning to a voice of one's own</w:t>
       </w:r>
     </w:p>
     <w:p>
@@ -683,7 +916,7 @@
         <w:rPr>
           <w:b w:val="0"/>
         </w:rPr>
-        <w:t>In Volume I, the subject's formation passes through foundation, self-determination, the decolonisation of the person, and the development of autonomy. Foundation denotes the adoption of one's own position; decolonisation means liberation from attitudes that effectively think and decide on one's behalf. Autonomy enables the person to maintain a position under pressure and construct their own project of the future.</w:t>
+        <w:t>“The Genesis of Subjecthood” examines the conditions under which a response emerges; “The Ontogenesis of Subjecthood” examines its development in a person's life. These are different questions. Establishing that received being is compatible with authorship does not yet explain how a particular person learns to respond, maintain identity, and enter into relationships.</w:t>
       </w:r>
     </w:p>
     <w:p>
@@ -691,7 +924,25 @@
         <w:rPr>
           <w:b w:val="0"/>
         </w:rPr>
-        <w:t>This stage cannot be replaced by an external command to “renounce yourself”. If a person cannot yet answer for themselves, renouncing independence may consolidate their dependence on another person or institution. That is why CTM persistently distinguishes Christian readdressing from totalitarian submission.</w:t>
+        <w:t>The starting point is the presumption of Reality's determinate meaningfulness: the distinction between correspondence and non-correspondence exists and can be discovered. On the human side, receptivity to freedom and the possibility of going beyond what has already been realised are necessary. Yet a “taste for freedom” can itself become arbitrariness. It must be connected with acceptance of reality, a hermeneutics of responsibility, orientation towards the maximal Ground, and readiness for verification.</w:t>
+      </w:r>
+    </w:p>
+    <w:p>
+      <w:r>
+        <w:t>Self-acceptance in this process does not mean complacency. A person accepts the bearer of their history in order to become able to continue and change it. Identity emerges as continuity of response: while changing, a person can acknowledge an earlier act as their own, correct its consequences, and avoid attributing the past to a stranger they supposedly once were.</w:t>
+      </w:r>
+    </w:p>
+    <w:p>
+      <w:r>
+        <w:t>Ontic subjecthood—the capacity to act and answer within a concrete world—forms the necessary basis of subsequent levels. One cannot leap over it directly into a universal mission. If a person speaks in the name of humanity's destiny but systematically evades simple obligations, the scale of their declaration indicates nothing in itself about the quality of their subjecthood. [II, “The Genesis of Subjecthood”; “The Ontogenesis of Subjecthood”, §§1–9.]</w:t>
+      </w:r>
+    </w:p>
+    <w:p>
+      <w:pPr>
+        <w:pStyle w:val="Heading2"/>
+      </w:pPr>
+      <w:r>
+        <w:t>Breakthrough and crystallisation</w:t>
       </w:r>
     </w:p>
     <w:p>
@@ -699,7 +950,23 @@
         <w:rPr>
           <w:b w:val="0"/>
         </w:rPr>
-        <w:t>However, Volume I takes independence to a radical limit: the subject must attempt to sustain a universal claim through their own powers and discover the impossibility of self-grounding. One cannot honestly recount this text while asserting that the requirement to pass through autonomy was entirely invented by a commentator. It is explicitly present in the “Essay” and in the model of ontological therapy. The question concerns the precise meaning of this autonomy. [I, “Essay”, ch. 2, §§2, 7, 9–11; “The Church as Infrastructure”, points 4–7.]</w:t>
+        <w:t>An ontological breakthrough occurs when what is questioned is not an individual task but the structure of the world within which tasks were distinguished. Such an experience expands what is possible without certifying truth. An intense experience, an unusual idea, or the destruction of an earlier identity may open a new horizon while also leading to false certainty.</w:t>
+      </w:r>
+    </w:p>
+    <w:p>
+      <w:r>
+        <w:rPr>
+          <w:b w:val="0"/>
+        </w:rPr>
+        <w:t>A breakthrough must therefore be followed by verification and crystallisation: the new distinction must acquire a stable form, language, practice, and capacity for transmission. Premature crystallisation is dangerous because it turns the first successful interpretation into an infallible system. The absence of crystallisation also has a cost: the experience remains a flash that does not change the next action.</w:t>
+      </w:r>
+    </w:p>
+    <w:p>
+      <w:r>
+        <w:rPr>
+          <w:b w:val="0"/>
+        </w:rPr>
+        <w:t>A generative transition goes further. The subject not only appropriates an existing form but creates new ways of recognition and action that others can acquire. Assessing such a transition requires specifying its scale. A solution new to one person is not necessarily new to a profession; a historically new institution does not necessarily open a new principle of human existence. [II, “The Ontogenesis of Subjecthood”, §§10–14; III, Part III.]</w:t>
       </w:r>
     </w:p>
     <w:p>
@@ -707,7 +974,7 @@
         <w:pStyle w:val="Heading2"/>
       </w:pPr>
       <w:r>
-        <w:t>The limit of self-grounding</w:t>
+        <w:t>Two independent capacities</w:t>
       </w:r>
     </w:p>
     <w:p>
@@ -715,7 +982,7 @@
         <w:rPr>
           <w:b w:val="0"/>
         </w:rPr>
-        <w:t>A person can author a project but cannot make themselves the cause of their own existence, abolish finitude, or guarantee the ultimate meaning of all the consequences. Expanding a project increases responsibility while revealing the disproportion between its claim and the powers available.</w:t>
+        <w:t>CTM distinguishes ontological competence from socio-ontic projectuality. The former enables the recognition of a project's grounds, limitations, and human meaning. The latter enables the creation of organisations, law, and economic and administrative forms through which the project enters history.</w:t>
       </w:r>
     </w:p>
     <w:p>
@@ -723,7 +990,7 @@
         <w:rPr>
           <w:b w:val="0"/>
         </w:rPr>
-        <w:t>This argument has a strong core: practical independence is not metaphysical self-sufficiency. Dependence on conditions does not imply that a person does not act; the reality of their action does not imply that they depend on nothing. CTM attempts to hold both sides together.</w:t>
+        <w:t>An insightful thinker may lack the ability to organise collective action. An effective organiser may implement a profoundly mistaken picture of the world. Historical power is therefore not sufficient evidence of truth, and sound understanding is not a sufficient condition for a historical result.</w:t>
       </w:r>
     </w:p>
     <w:p>
@@ -731,15 +998,25 @@
         <w:rPr>
           <w:b w:val="0"/>
         </w:rPr>
-        <w:t>Volume I's stronger proposition—that every subject must undergo an actual attempt at universal self-grounding—requires a separate justification. We may ask why a person cannot accept finitude and responsibility from the outset, without claiming absolute independence. Indeed, “The Genesis of Subjecthood” in Volume II begins with a hermeneutics of received existence and responsibility. A coherent reading of the corpus must therefore distinguish the necessary development of independence from a possible radical testing of its limit.</w:t>
-      </w:r>
+        <w:t>Messianic identity means understanding one's own life as a vocation and mission. It does not guarantee a good direction: a nation, class, or state can also be elevated to the position of an absolute addressee. In the Christian version, the person accepts being sent without appropriating the role of ultimate saviour. Their concrete project remains human, limited, and corrigible. [II, “The Ontogenesis of Subjecthood”, §§15–18; “Eschatological Subjecthood”, §§5–8.]</w:t>
+      </w:r>
+    </w:p>
+    <w:p>
+      <w:bookmarkStart w:id="7" w:name="section_7"/>
+      <w:pPr>
+        <w:pStyle w:val="Heading1"/>
+      </w:pPr>
+      <w:r>
+        <w:t>7 The Logos and the Possibility of Meaning</w:t>
+      </w:r>
+      <w:bookmarkEnd w:id="7"/>
     </w:p>
     <w:p>
       <w:pPr>
         <w:pStyle w:val="Heading2"/>
       </w:pPr>
       <w:r>
-        <w:t>What is readdressed</w:t>
+        <w:t>Why connectedness is not enough</w:t>
       </w:r>
     </w:p>
     <w:p>
@@ -747,7 +1024,7 @@
         <w:rPr>
           <w:b w:val="0"/>
         </w:rPr>
-        <w:t>Ontological readdressing means a change in the ultimate ground of life. The person ceases to treat their own preservation, desire, or historical success as an absolute criterion. Yet the decision remains their decision. They neither transfer responsibility to someone else nor acquire the right to justify any action by appealing to a higher will.</w:t>
+        <w:t>CTM distinguishes the existence of a connection from a meaningful encounter. People may constantly exchange messages, trade, and perform roles without recognising one another as independent bearers of a response. Connectedness as such allows manipulation and domination.</w:t>
       </w:r>
     </w:p>
     <w:p>
@@ -755,7 +1032,7 @@
         <w:rPr>
           <w:b w:val="0"/>
         </w:rPr>
-        <w:t>In the Christian perspective, the addressee is God, revealed in Christ. Yet God's name may conceal an entirely different dependence. If the actual ultimate ground is a leader's infallibility, an institution's prestige, or a national victory, religious language does not by itself establish that life has been readdressed to God.</w:t>
+        <w:t>Volume I expresses this through the distinction between closed and grounded relationality. A closed relationship attempts to find its ultimate ground solely in its participants; each risks making themselves the final measure of the other. A grounded relationship presupposes that neither participant has the right to define the other definitively, because both relate to a Ground that exceeds them.</w:t>
       </w:r>
     </w:p>
     <w:p>
@@ -763,25 +1040,89 @@
         <w:rPr>
           <w:b w:val="0"/>
         </w:rPr>
-        <w:t>The practical test concerns the possibility of correction: can the person acknowledge that their interpretation of God's will was mistaken? Do they retain responsibility for their own understanding? Can they acknowledge the reality of another person when that person obstructs their project? Readdressing that excludes such questions risks reproducing precisely the colonisation it should overcome.</w:t>
-      </w:r>
-    </w:p>
-    <w:p>
-      <w:bookmarkStart w:id="5" w:name="section_5"/>
+        <w:t>In this construction, the Logos fulfils two connected roles. Philosophically, He denotes the ultimate determinacy of meaning that makes it possible to distinguish truth from falsehood and adequacy from arbitrariness. Theologically, the Logos is the Son of God who became human. These registers must remain connected without substituting the first for the second. Christ is not exhausted by a principle of logical coherence. [I, “Essay”, chs. 4–6; “Towards an Ontology of the Logos”; III, §§9–12.]</w:t>
+      </w:r>
+    </w:p>
+    <w:p>
+      <w:pPr>
+        <w:pStyle w:val="Heading2"/>
+      </w:pPr>
+      <w:r>
+        <w:t>Methodological monotheism</w:t>
+      </w:r>
+    </w:p>
+    <w:p>
+      <w:r>
+        <w:rPr>
+          <w:b w:val="0"/>
+        </w:rPr>
+        <w:t>A person has many real attachments and obligations: family, profession, people, state, and their own body. CTM does not require their elimination. Methodological monotheism means that partial grounds must find their place and measure in relation to the maximal Ground. None of them may demand the whole person without being subjected to examination.</w:t>
+      </w:r>
+    </w:p>
+    <w:p>
+      <w:r>
+        <w:rPr>
+          <w:b w:val="0"/>
+        </w:rPr>
+        <w:t>This principle has a practical meaning. If the state demands the sacrifice of truth for the state's benefit, the question arises of its right to make that demand. If a family requires injustice towards an outsider, closeness alone does not cancel what is right. If an ecclesiastical organisation demands the defence of its reputation against an acknowledged fact, the institution risks occupying the place of the Ground it should serve.</w:t>
+      </w:r>
+    </w:p>
+    <w:p>
+      <w:r>
+        <w:rPr>
+          <w:b w:val="0"/>
+        </w:rPr>
+        <w:t>Yet the principle of a single ultimate ground is not equivalent to the full confession of the Trinity. In Volume II, the author explicitly limits its status to a structure of orientation. It may prepare a theological inquiry but does not replace it. A strong analysis must show at what stage specifically Christian content is introduced. [II, “The Genesis of Subjecthood”, §5.3.]</w:t>
+      </w:r>
+    </w:p>
+    <w:p>
+      <w:pPr>
+        <w:pStyle w:val="Heading2"/>
+      </w:pPr>
+      <w:r>
+        <w:t>Idolatry as an error of grounding</w:t>
+      </w:r>
+    </w:p>
+    <w:p>
+      <w:r>
+        <w:rPr>
+          <w:b w:val="0"/>
+        </w:rPr>
+        <w:t>In CTM, an idol is not merely a cultic image. Idolatry arises when a finite object, model, or institution acquires the status of ultimate Reality. The person begins to protect it against every test and to subordinate other people to it.</w:t>
+      </w:r>
+    </w:p>
+    <w:p>
+      <w:r>
+        <w:rPr>
+          <w:b w:val="0"/>
+        </w:rPr>
+        <w:t>This makes it possible to criticise idolatry within religiosity itself. Correctly naming the object of worship does not guarantee a right relationship. A person may say “God” while meaning the absolute confirmation of their own group. They may venerate truth while actually defending their own infallibility. Logocentricity is therefore determined by what a person acts from, not simply by the vocabulary of their self-description.</w:t>
+      </w:r>
+    </w:p>
+    <w:p>
+      <w:r>
+        <w:rPr>
+          <w:b w:val="0"/>
+        </w:rPr>
+        <w:t>Logofugality, correspondingly, means withdrawal from such verification and from connection with the Ground. It may be highly organised and technologically effective. The ordering of meaning is not identical with moral truth: a false project can also create discipline and stable procedures. Here the distinctions of the later volumes refine the sharper oppositions of the early philosophical part.</w:t>
+      </w:r>
+    </w:p>
+    <w:p>
+      <w:bookmarkStart w:id="8" w:name="section_8"/>
       <w:pPr>
         <w:pStyle w:val="Heading1"/>
       </w:pPr>
       <w:r>
-        <w:t>5 The Architecture of Human Response</w:t>
-      </w:r>
-      <w:bookmarkEnd w:id="5"/>
+        <w:t>8 The Image of God and the Fullness of Personhood</w:t>
+      </w:r>
+      <w:bookmarkEnd w:id="8"/>
     </w:p>
     <w:p>
       <w:pPr>
         <w:pStyle w:val="Heading2"/>
       </w:pPr>
       <w:r>
-        <w:t>Dynamic Iconic Space</w:t>
+        <w:t>Individuality and irreplaceability</w:t>
       </w:r>
     </w:p>
     <w:p>
@@ -789,7 +1130,7 @@
         <w:rPr>
           <w:b w:val="0"/>
         </w:rPr>
-        <w:t>DIS is the way the world is present to a subject. It includes not only information about objects but also connections, significance, scale, time, threats, expectations, and images of what is possible. “Iconic” here is not reducible to a picture or an ecclesiastical icon: it concerns the representation of reality through which the subject orients themselves and acts.</w:t>
+        <w:t>A person's biographical uniqueness does not in itself disclose what CTM seeks in personhood. A combination of causes can also be unique. The project asks a different question: why does this particular person have the right to a response of their own, and why can they not be replaced by a functionally equivalent performer?</w:t>
       </w:r>
     </w:p>
     <w:p>
@@ -797,7 +1138,7 @@
         <w:rPr>
           <w:b w:val="0"/>
         </w:rPr>
-        <w:t>The quality of DIS is not determined by the quantity of knowledge alone. One can know many details without seeing the whole; think on vast historical scales without discerning a concrete person; or maintain a clear picture of the present while overlooking delayed consequences. What matters, therefore, is scope, resolution, connectedness, depth, dynamism, openness, and the ability to sustain a contradiction without hastily eliminating one of its sides.</w:t>
+        <w:t>The theological answer is developed through the image of God and likeness. Image denotes the possibility of personal response given to the human being; likeness denotes its unfolding towards the fullness of relationship with God. This is a working distinction within the architecture of response, not an exhaustive definition of every meaning of image and likeness in the Christian tradition. The pneumatology essay explicitly limits its subject in this way.</w:t>
       </w:r>
     </w:p>
     <w:p>
@@ -805,7 +1146,7 @@
         <w:rPr>
           <w:b w:val="0"/>
         </w:rPr>
-        <w:t>A person who treats a state budget as the ruler's personal purse is not simply mistaken about particular figures. The object itself, causality, and responsibility are represented differently. A change in DIS means that the budget becomes visible as a distributed system of obligations, revenues, expenditure, and future consequences. [II, “The Quality of Ontology”, §§1–3; III, §22 and Part IV.]</w:t>
+        <w:t>Human development does not create dignity out of nothing or make a less competent person less worthy of care. A crucial implication of CTM's eschatological part is that the value of a concrete person cannot be measured by their current productivity. The vocation to communion with God precedes assessment of the actual success of their response. This is particularly significant for understanding a child, a sick person, someone dependent on others, or a person with disabilities. This last application is an inference of the present analysis from the distinction between gift and actualisation, not a separate developed theory in the corpus. [III, §11; “In Search of Pneumatology”, §2; II, “Eschatological Subjecthood”, §§11–14.]</w:t>
       </w:r>
     </w:p>
     <w:p>
@@ -813,7 +1154,7 @@
         <w:pStyle w:val="Heading2"/>
       </w:pPr>
       <w:r>
-        <w:t>Operating System</w:t>
+        <w:t>Deification and the preservation of the human</w:t>
       </w:r>
     </w:p>
     <w:p>
@@ -821,7 +1162,7 @@
         <w:rPr>
           <w:b w:val="0"/>
         </w:rPr>
-        <w:t>OS is the set of ways of working with reality. CTM distinguishes receptive-interpretive, projective-executive, and reflexive-corrective circuits: how the subject receives and understands information; how they plan and carry out action; and how they assess consequences and correct themselves.</w:t>
+        <w:t>Within CTM's logic, deification means participation in God's life while preserving the distinction between Creator and creature. The human being neither becomes their own source nor disappears into an impersonal whole. On the contrary, the fullness of communion requires the preservation of the one who communes.</w:t>
       </w:r>
     </w:p>
     <w:p>
@@ -829,7 +1170,7 @@
         <w:rPr>
           <w:b w:val="0"/>
         </w:rPr>
-        <w:t>A person may see a problem without possessing an operation that enables them to solve it. An organisation may gather reliable information but lack a procedure for changing a decision after receiving it. The reverse situation is also possible: a procedure formally exists but is never activated in a particular class of situations. These cases require different explanations and different changes.</w:t>
+        <w:t>Renouncing autonomous self-grounding is therefore not equivalent to renouncing personhood. The claim to be an absolute source is relinquished, while name, history, response, and responsibility remain. This is the fundamental difference between participation and absorption.</w:t>
       </w:r>
     </w:p>
     <w:p>
@@ -837,7 +1178,7 @@
         <w:rPr>
           <w:b w:val="0"/>
         </w:rPr>
-        <w:t>OS is not a hidden second subject inside the person. It is an analytical designation for the operations available to and used by them. Likewise, DIS does not “make decisions”: it is the whole person who sees, decides, and acts.</w:t>
+        <w:t>The formula “Christ bin”, which runs through Volume I, expresses the radical character of Christian self-determination: Christianity must become a way of existing rather than an external relationship to a revered model. It must be read through participation in Christ, not as a human appropriation of the unique hypostatic status of the incarnate Son. Volume II supports precisely this distinction: God enters the ontic sphere in Christ immediately and hypostatically; the human historical response is derivative and mediated. [I, “Towards an Ontology of the Logos”; “Faith as Competence”; II, “Eschatological Subjecthood”, §§6, 13.]</w:t>
       </w:r>
     </w:p>
     <w:p>
@@ -845,7 +1186,12 @@
         <w:pStyle w:val="Heading2"/>
       </w:pPr>
       <w:r>
-        <w:t>Subjecthood and the Scenario Book</w:t>
+        <w:t>Absolute significance without absolute being</w:t>
+      </w:r>
+    </w:p>
+    <w:p>
+      <w:r>
+        <w:t>Volume II distinguishes God's absoluteness from the person's absolute significance for God. The human being is finite and created. But this finitude does not mean that the person is replaceable or may be sacrificed to an impersonal totality as expendable material.</w:t>
       </w:r>
     </w:p>
     <w:p>
@@ -853,7 +1199,30 @@
         <w:rPr>
           <w:b w:val="0"/>
         </w:rPr>
-        <w:t>The third dimension answers the question: who is the actual author of the response? Who has initiative and the right to object, correct, and stop? To whom do consequences return? In a complex system, these powers may be distributed. The absence of a single centre does not in itself mean the absence of subjecthood; one must determine whether the distributed functions form a connected circuit.</w:t>
+        <w:t>The Christian promise of eternal life concerns the concrete person, not merely the preservation of information about them, their social contribution, or a general human type. The question of personhood therefore acquires eschatological depth: what enables this very person to preserve their identity in definitive communion with God?</w:t>
+      </w:r>
+    </w:p>
+    <w:p>
+      <w:r>
+        <w:t>Within its Christian presuppositions, CTM here offers a theological grounding of irreplaceability. But the assertion that no other philosophical ground for irreplaceability is possible would be a separate, broader thesis. Showing the strength of the Christian solution is not enough to establish it: competing arguments must be considered. [II, “Eschatological Subjecthood”, §§11–12.]</w:t>
+      </w:r>
+    </w:p>
+    <w:p>
+      <w:bookmarkStart w:id="9" w:name="section_9"/>
+      <w:pPr>
+        <w:pStyle w:val="Heading1"/>
+      </w:pPr>
+      <w:r>
+        <w:t>9 Incarnation Cross and Resurrection</w:t>
+      </w:r>
+      <w:bookmarkEnd w:id="9"/>
+    </w:p>
+    <w:p>
+      <w:pPr>
+        <w:pStyle w:val="Heading2"/>
+      </w:pPr>
+      <w:r>
+        <w:t>God's initiative</w:t>
       </w:r>
     </w:p>
     <w:p>
@@ -861,7 +1230,7 @@
         <w:rPr>
           <w:b w:val="0"/>
         </w:rPr>
-        <w:t>The formula “DIS × OS × subjecthood” expresses the interdependence of these dimensions. It is not a calculation with known units and coefficients. A rich picture of the world does not ensure the capacity to act; developed operations do not ensure authorship of one's own; strong initiative does not compensate for blindness.</w:t>
+        <w:t>Presenting CTM solely as a ladder of human effort would substantially distort it. The person tests their grounds, suffers collapse, readdresses their life—and seemingly reaches God through their own effort. Volume II states the opposite clearly: the human movement towards God is grounded in God's prior movement towards the human being.</w:t>
       </w:r>
     </w:p>
     <w:p>
@@ -869,7 +1238,15 @@
         <w:rPr>
           <w:b w:val="0"/>
         </w:rPr>
-        <w:t>The Scenario Book denotes stable rules connecting these dimensions in a particular situation. For example, an institution knows how to revise decisions but recognises any public criticism as a threat. The available operation of correction is then systematically blocked specifically in situations of criticism. To demonstrate the existence of such a rule, one episode is insufficient: comparable cases or independent corroboration are required. [III, §22a, §§113a, 118a.]</w:t>
+        <w:t>The incarnation means that the Logos enters created reality, assuming human nature, body, and history. The Ground does not merely confront the human being with a demand from outside. In Christ, it becomes a participant in human vulnerability. The project's theology therefore cannot be exhausted by a universal technique for navigating between maps.</w:t>
+      </w:r>
+    </w:p>
+    <w:p>
+      <w:r>
+        <w:rPr>
+          <w:b w:val="0"/>
+        </w:rPr>
+        <w:t>This also limits a negative attitude towards the ontic. If the Son assumes body and history, the world's concreteness is not merely an obstacle to ascent towards meaning. It becomes a place of encounter and response. Work, bodily care, and the just ordering of relationships acquire significance as forms of historical embodiment, although none of them becomes the Kingdom of God itself. [II, “Eschatological Subjecthood”, §§6, 13–14.]</w:t>
       </w:r>
     </w:p>
     <w:p>
@@ -877,7 +1254,12 @@
         <w:pStyle w:val="Heading2"/>
       </w:pPr>
       <w:r>
-        <w:t>The quality of ontology and ontological competence</w:t>
+        <w:t>The Cross as a test of the ground</w:t>
+      </w:r>
+    </w:p>
+    <w:p>
+      <w:r>
+        <w:t>The Cross occupies a central place in CTM because it separates fidelity to truth from a guarantee of one's own success. If a person regards as true only what preserves their strength, prestige, and safety, they continue to treat themselves as their ultimate ground. The practice of the Cross means the possibility of relinquishing this condition.</w:t>
       </w:r>
     </w:p>
     <w:p>
@@ -885,7 +1267,7 @@
         <w:rPr>
           <w:b w:val="0"/>
         </w:rPr>
-        <w:t>The quality of ontology characterises the organisation of the subject's operative world. Ontological competence is the subject's capacity to orient themselves within that world, recognise the limitations of their own map, coordinate the necessary knowledge and ways of acting, withstand discrepancy, and produce a response.</w:t>
+        <w:t>Yet not every sacrifice becomes Christian. A person can die for a false project, under someone else's coercion, or for their own grandiosity. The magnitude of the loss does not prove the truth of its addressee. Christian discernment requires examining the relationship to truth, the other's freedom, responsibility, and Christ Himself.</w:t>
       </w:r>
     </w:p>
     <w:p>
@@ -893,25 +1275,65 @@
         <w:rPr>
           <w:b w:val="0"/>
         </w:rPr>
-        <w:t>This distinction protects the project against intellectualism. An extensive theory does not guarantee the capacity to act, and clear understanding does not guarantee implementation of a project. Competence includes a relationship to one's own limits: finding a specialist, acknowledging insufficient data, or stopping an inapplicable method is sometimes more important than offering another explanation. Groundedness and the ordering of values run through the entire architecture: for what purpose are capacities used, and what is sacrificed when goods conflict? [II, “The Quality of Ontology”, §§4–9; III, §§32–36.]</w:t>
-      </w:r>
-    </w:p>
-    <w:p>
-      <w:bookmarkStart w:id="6" w:name="section_6"/>
+        <w:t>The practice of the Cross must therefore not be turned into a demand to expose oneself constantly to danger or to allow an institution to dispose of another person's suffering. In the terms of later CTM, whoever demands a cost must justify their right to demand it; voluntary ascetic discipline is not identical with the external dispossession of subjecthood. A theological formula does not dispense with this examination.</w:t>
+      </w:r>
+    </w:p>
+    <w:p>
+      <w:r>
+        <w:rPr>
+          <w:b w:val="0"/>
+        </w:rPr>
+        <w:t>Volume II gives the Cross an additional interpretation: God permits the actual consequences of human judgement upon Himself without recognising that judgement as true. Human freedom is so serious that its false response becomes a historical event. This theological reading by the author reveals the cost of relationship, but does not mean that a human verdict acquires power over God's ultimate truth. [I, “Faith as Competence”; II, “The Ontogenesis of Subjecthood”, §22; “Eschatological Subjecthood”, §13.]</w:t>
+      </w:r>
+    </w:p>
+    <w:p>
+      <w:pPr>
+        <w:pStyle w:val="Heading2"/>
+      </w:pPr>
+      <w:r>
+        <w:t>Why the argument is incomplete without the resurrection</w:t>
+      </w:r>
+    </w:p>
+    <w:p>
+      <w:r>
+        <w:rPr>
+          <w:b w:val="0"/>
+        </w:rPr>
+        <w:t>Stopping at the Cross as honesty in the face of defeat would yield a philosophy of dignity in catastrophe. CTM's Christian meaning is broader. The resurrection means that death and historical judgement do not constitute the final horizon of the human nature assumed by the Logos.</w:t>
+      </w:r>
+    </w:p>
+    <w:p>
+      <w:r>
+        <w:rPr>
+          <w:b w:val="0"/>
+        </w:rPr>
+        <w:t>Faith does not verbally turn defeat into victory. It relates the historical event to a promised fullness whose source is in God. The human capacity to withstand crisis neither produces the resurrection nor proves it empirically. The resurrection enters the project as the content of the Christian proclamation and the ground of hope.</w:t>
+      </w:r>
+    </w:p>
+    <w:p>
+      <w:r>
+        <w:rPr>
+          <w:b w:val="0"/>
+        </w:rPr>
+        <w:t>This distinction avoids two reductions. The first turns Christianity into heroic psychology: endure everything, and thereby save yourself. The second turns hope into a denial of consequences: since God will prevail, human error is insignificant. CTM requires both the reality of historical cost and openness to a horizon not exhausted by history.</w:t>
+      </w:r>
+    </w:p>
+    <w:p>
+      <w:bookmarkStart w:id="10" w:name="section_10"/>
       <w:pPr>
         <w:pStyle w:val="Heading1"/>
       </w:pPr>
       <w:r>
-        <w:t>6 Personal Formation and Historical Action</w:t>
-      </w:r>
-      <w:bookmarkEnd w:id="6"/>
+        <w:t>10 Faith as Competence and the Language of God</w:t>
+      </w:r>
+      <w:bookmarkEnd w:id="10"/>
     </w:p>
     <w:p>
       <w:pPr>
         <w:pStyle w:val="Heading2"/>
       </w:pPr>
       <w:r>
-        <w:t>From accepting one's beginning to a voice of one's own</w:t>
+        <w:t>From conviction to the capacity to live</w:t>
       </w:r>
     </w:p>
     <w:p>
@@ -919,7 +1341,7 @@
         <w:rPr>
           <w:b w:val="0"/>
         </w:rPr>
-        <w:t>“The Genesis of Subjecthood” examines the conditions under which a response emerges; “The Ontogenesis of Subjecthood” examines its development in a person's life. These are different questions. Establishing that received being is compatible with authorship does not yet explain how a particular person learns to respond, maintain identity, and enter into relationships.</w:t>
+        <w:t>In CTM, faith has psychological, social, and intellectual manifestations but is not exhausted by them. Experience, belonging, and conviction may be present in very different religious and ideological systems. The specifically Christian question concerns the source of life and the relationship to the future.</w:t>
       </w:r>
     </w:p>
     <w:p>
@@ -927,17 +1349,15 @@
         <w:rPr>
           <w:b w:val="0"/>
         </w:rPr>
-        <w:t>The starting point is the presumption of Reality's determinate meaningfulness: the distinction between correspondence and non-correspondence exists and can be discovered. On the human side, receptivity to freedom and the possibility of going beyond what has already been realised are necessary. Yet a “taste for freedom” can itself become arbitrariness. It must be connected with acceptance of reality, a hermeneutics of responsibility, orientation towards the maximal Ground, and readiness for verification.</w:t>
-      </w:r>
-    </w:p>
-    <w:p>
-      <w:r>
-        <w:t>Self-acceptance in this process does not mean complacency. A person accepts the bearer of their history in order to become able to continue and change it. Identity emerges as continuity of response: while changing, a person can acknowledge an earlier act as their own, correct its consequences, and avoid attributing the past to a stranger they supposedly once were.</w:t>
-      </w:r>
-    </w:p>
-    <w:p>
-      <w:r>
-        <w:t>Ontic subjecthood—the capacity to act and answer within a concrete world—forms the necessary basis of subsequent levels. One cannot leap over it directly into a universal mission. If a person speaks in the name of humanity's destiny but systematically evades simple obligations, the scale of their declaration indicates nothing in itself about the quality of their subjecthood. [II, “The Genesis of Subjecthood”; “The Ontogenesis of Subjecthood”, §§1–9.]</w:t>
+        <w:t>Competence denotes a stable capacity to act where knowledge and instructions provide no ready-made solution. A person may know much about forgiveness and be unable to forgive; understand the necessity of truth and conceal it when threatened with loss. Between the content of consciousness and a way of existing there remains a transition that cannot be accomplished through a definition alone.</w:t>
+      </w:r>
+    </w:p>
+    <w:p>
+      <w:r>
+        <w:rPr>
+          <w:b w:val="0"/>
+        </w:rPr>
+        <w:t>Faith as competence is the capacity to maintain orientation towards God and truth under changing conditions, accept responsibility, examine one's own understanding, and renew one's response. It does not guarantee the rightness of every decision or make the believer omniscient. Its maturity includes the capacity to acknowledge error without destroying the relationship to the Ground itself. [I, “On the Nature of Faith”; “Faith as Competence”; III, Part XIII.]</w:t>
       </w:r>
     </w:p>
     <w:p>
@@ -945,7 +1365,7 @@
         <w:pStyle w:val="Heading2"/>
       </w:pPr>
       <w:r>
-        <w:t>Breakthrough and crystallisation</w:t>
+        <w:t>God's silence and the competitive world</w:t>
       </w:r>
     </w:p>
     <w:p>
@@ -953,7 +1373,7 @@
         <w:rPr>
           <w:b w:val="0"/>
         </w:rPr>
-        <w:t>An ontological breakthrough occurs when what is questioned is not an individual task but the structure of the world within which tasks were distinguished. Such an experience expands what is possible without certifying truth. An intense experience, an unusual idea, or the destruction of an earlier identity may open a new horizon while also leading to false certainty.</w:t>
+        <w:t>“The Language of God” in Volume I poses a painful question: how can confession of the God of Love be reconciled with the reality of suffering and the experience of His silence? This is not simply a chapter about sacred language or the logical structure of creation. It examines the discrepancy between the intervention a person expects and the transformation of the person themselves towards which Christianity is directed.</w:t>
       </w:r>
     </w:p>
     <w:p>
@@ -961,7 +1381,7 @@
         <w:rPr>
           <w:b w:val="0"/>
         </w:rPr>
-        <w:t>A breakthrough must therefore be followed by verification and crystallisation: the new distinction must acquire a stable form, language, practice, and capacity for transmission. Premature crystallisation is dangerous because it turns the first successful interpretation into an infallible system. The absence of crystallisation also has a cost: the experience remains a flash that does not change the next action.</w:t>
+        <w:t>Competitive ontology understands being through the struggle for preservation, superiority, and control. In such a world, even God may be conceived as the strongest participant, expected to secure victory for one's own side. Solidaric ontology presupposes another kind of relationship: the fullness of one should not be realised through the destruction of another. Humility here involves refusing to appropriate the centre of being, while purposiveness involves readiness to enter genuinely into a different relationship to life.</w:t>
       </w:r>
     </w:p>
     <w:p>
@@ -969,7 +1389,7 @@
         <w:rPr>
           <w:b w:val="0"/>
         </w:rPr>
-        <w:t>A generative transition goes further. The subject not only appropriates an existing form but creates new ways of recognition and action that others can acquire. Assessing such a transition requires specifying its scale. A solution new to one person is not necessarily new to a profession; a historically new institution does not necessarily open a new principle of human existence. [II, “The Ontogenesis of Subjecthood”, §§10–14; III, Part III.]</w:t>
+        <w:t>This reading explains why Christianity is not obliged to confirm every human expectation of power. It does not, however, resolve every question of theodicy. The fact that coercive intervention may suppress freedom does not yet explain every instance of suffering, especially the suffering of those unable to accept it meaningfully. The chapter should therefore be read as an interpretation of the Christian way of responding, not presented as a completed proof that everything that happens is justified. [I, “The Language of God”.]</w:t>
       </w:r>
     </w:p>
     <w:p>
@@ -977,7 +1397,7 @@
         <w:pStyle w:val="Heading2"/>
       </w:pPr>
       <w:r>
-        <w:t>Two independent capacities</w:t>
+        <w:t>Repentance and ascetic practice</w:t>
       </w:r>
     </w:p>
     <w:p>
@@ -985,7 +1405,7 @@
         <w:rPr>
           <w:b w:val="0"/>
         </w:rPr>
-        <w:t>CTM distinguishes ontological competence from socio-ontic projectuality. The former enables the recognition of a project's grounds, limitations, and human meaning. The latter enables the creation of organisations, law, and economic and administrative forms through which the project enters history.</w:t>
+        <w:t>In CTM, repentance concerns the grounds of perception and action. A person not only regrets a transgression but examines what understanding of themselves and the world made it possible. If they still regard another person as a means to their own reassurance, an isolated apology may leave the recurrent structure of the relationship unchanged.</w:t>
       </w:r>
     </w:p>
     <w:p>
@@ -993,7 +1413,7 @@
         <w:rPr>
           <w:b w:val="0"/>
         </w:rPr>
-        <w:t>An insightful thinker may lack the ability to organise collective action. An effective organiser may implement a profoundly mistaken picture of the world. Historical power is therefore not sufficient evidence of truth, and sound understanding is not a sufficient condition for a historical result.</w:t>
+        <w:t>Ontological asceticism denotes the discipline of relinquishing unsustainable elements of one's own map. This is a difficult capacity: a mistaken construction may sustain dignity, belonging, and familiar security. Relinquishing it requires not only an argument but also readiness to live differently.</w:t>
       </w:r>
     </w:p>
     <w:p>
@@ -1001,25 +1421,30 @@
         <w:rPr>
           <w:b w:val="0"/>
         </w:rPr>
-        <w:t>Messianic identity means understanding one's own life as a vocation and mission. It does not guarantee a good direction: a nation, class, or state can also be elevated to the position of an absolute addressee. In the Christian version, the person accepts being sent without appropriating the role of ultimate saviour. Their concrete project remains human, limited, and corrigible. [II, “The Ontogenesis of Subjecthood”, §§15–18; “Eschatological Subjecthood”, §§5–8.]</w:t>
-      </w:r>
-    </w:p>
-    <w:p>
-      <w:bookmarkStart w:id="7" w:name="section_7"/>
+        <w:t>Constant examination does not, however, mean chronic psychological destabilisation. Stable habits, skills, and forms of life can support a response. What matters is their openness to correction, not the compulsory destruction of stability in every act. Here the later method permits a more careful reading of Volume I's language of continuous rupture.</w:t>
+      </w:r>
+    </w:p>
+    <w:p>
+      <w:bookmarkStart w:id="11" w:name="section_11"/>
       <w:pPr>
         <w:pStyle w:val="Heading1"/>
       </w:pPr>
       <w:r>
-        <w:t>7 The Logos and the Possibility of Meaning</w:t>
-      </w:r>
-      <w:bookmarkEnd w:id="7"/>
+        <w:t>11 The Church as Event and Historical Form</w:t>
+      </w:r>
+      <w:bookmarkEnd w:id="11"/>
     </w:p>
     <w:p>
       <w:pPr>
         <w:pStyle w:val="Heading2"/>
       </w:pPr>
       <w:r>
-        <w:t>Why connectedness is not enough</w:t>
+        <w:t>Communion rather than mutual confirmation</w:t>
+      </w:r>
+    </w:p>
+    <w:p>
+      <w:r>
+        <w:t>Ontological communication begins where encountering the other can not only provide new information but also change the grounds of a person’s understanding. This requires recognising the interlocutor’s independent reality, which cannot be reduced to their place in one’s own picture of the world. The other’s response may disclose something that this map cannot accommodate.</w:t>
       </w:r>
     </w:p>
     <w:p>
@@ -1027,7 +1452,7 @@
         <w:rPr>
           <w:b w:val="0"/>
         </w:rPr>
-        <w:t>CTM distinguishes the existence of a connection from a meaningful encounter. People may constantly exchange messages, trade, and perform roles without recognising one another as independent bearers of a response. Connectedness as such allows manipulation and domination.</w:t>
+        <w:t>For CTM, this is essential in relation to both God and other human beings. Communion is not reducible to intensity of experience or agreement. Even conflict can become an event of encounter if its participants permit their grounds to be examined. Conversely, unanimity may result from the systematic exclusion of dissenters.</w:t>
       </w:r>
     </w:p>
     <w:p>
@@ -1035,7 +1460,15 @@
         <w:rPr>
           <w:b w:val="0"/>
         </w:rPr>
-        <w:t>Volume I expresses this through the distinction between closed and grounded relationality. A closed relationship attempts to find its ultimate ground solely in its participants; each risks making themselves the final measure of the other. A grounded relationship presupposes that neither participant has the right to define the other definitively, because both relate to a Ground that exceeds them.</w:t>
+        <w:t>The Church is considered as the space in which such communication should acquire a stable historical form. The theological meaning of the assembly and the Eucharist is connected with participation in the life of the Kingdom and the experience of communion not exhausted by the rules of the competitive world. Conversation does not replace the sacrament: the question concerns the human form of participation in God's action. [I, “The Starting Point: Once the Original”; “Essay”, chs. 6–7; II, “Eschatological Subjecthood”, §§9–10.]</w:t>
+      </w:r>
+    </w:p>
+    <w:p>
+      <w:pPr>
+        <w:pStyle w:val="Heading2"/>
+      </w:pPr>
+      <w:r>
+        <w:t>Why infrastructure is needed</w:t>
       </w:r>
     </w:p>
     <w:p>
@@ -1043,7 +1476,23 @@
         <w:rPr>
           <w:b w:val="0"/>
         </w:rPr>
-        <w:t>In this construction, the Logos fulfils two connected roles. Philosophically, He denotes the ultimate determinacy of meaning that makes it possible to distinguish truth from falsehood and adequacy from arbitrariness. Theologically, the Logos is the Son of God who became human. These registers must remain connected without substituting the first for the second. Christ is not exhausted by a principle of logical coherence. [I, “Essay”, chs. 4–6; “Towards an Ontology of the Logos”; III, §§9–12.]</w:t>
+        <w:t>An individual event of encounter may prove impossible to transmit or reproduce. Historical form—worship, teaching, community, discipline, memory, and guidance—creates conditions in which a new person can enter the experience and develop a response of their own.</w:t>
+      </w:r>
+    </w:p>
+    <w:p>
+      <w:r>
+        <w:rPr>
+          <w:b w:val="0"/>
+        </w:rPr>
+        <w:t>The word “infrastructure” must therefore not imply that the Church is merely a service organisation. It isolates one aspect of the Church's historical existence: what makes the formation, support, verification, and reproduction of eschatological subjecthood possible. This is a functional perspective within a theological understanding, not an exhaustive dogmatic definition.</w:t>
+      </w:r>
+    </w:p>
+    <w:p>
+      <w:r>
+        <w:rPr>
+          <w:b w:val="0"/>
+        </w:rPr>
+        <w:t>An ecclesial form may fulfil its function, be in the process of acquiring it, compensate for the absence of a result, simulate that result, or produce the opposite effect. For example, guidance intended to teach discernment may consolidate an inability to decide without a guide. Such a diagnosis requires concrete evidence about practice; a critical tone alone is insufficient. [III, Part XIII; “In Search of Pneumatology”, §16.]</w:t>
       </w:r>
     </w:p>
     <w:p>
@@ -1051,7 +1500,7 @@
         <w:pStyle w:val="Heading2"/>
       </w:pPr>
       <w:r>
-        <w:t>Methodological monotheism</w:t>
+        <w:t>Obedience and responsibility</w:t>
       </w:r>
     </w:p>
     <w:p>
@@ -1059,7 +1508,7 @@
         <w:rPr>
           <w:b w:val="0"/>
         </w:rPr>
-        <w:t>A person has many real attachments and obligations: family, profession, people, state, and their own body. CTM does not require their elimination. Methodological monotheism means that partial grounds must find their place and measure in relation to the maximal Ground. None of them may demand the whole person without being subjected to examination.</w:t>
+        <w:t>CTM makes it possible to put a rigorous question to obedience: does it enable a fuller personal response, or transfer authorship of the person's life to someone else? Outwardly similar actions may have different meanings. Voluntary acceptance of discipline can expand freedom; coercive suppression of objections can diminish it.</w:t>
       </w:r>
     </w:p>
     <w:p>
@@ -1067,7 +1516,30 @@
         <w:rPr>
           <w:b w:val="0"/>
         </w:rPr>
-        <w:t>This principle has a practical meaning. If the state demands the sacrifice of truth for the state's benefit, the question arises of its right to make that demand. If a family requires injustice towards an outsider, closeness alone does not cancel what is right. If an ecclesiastical organisation demands the defence of its reputation against an acknowledged fact, the institution risks occupying the place of the Ground it should serve.</w:t>
+        <w:t>The distinction cannot be established from the word “obedience” or the fact of restriction alone. One must determine whether verification, responsibility, the possibility of identifying a discrepancy, and recognition of the limits of the guide's authority are preserved. An institution cannot declare itself the ultimate addressee of readdressing and appropriate God's action.</w:t>
+      </w:r>
+    </w:p>
+    <w:p>
+      <w:r>
+        <w:t>One of CTM's central ecclesiological questions can therefore be formulated as follows: does ecclesial life produce people able to answer God themselves? Posing the question in this way does not require the rejection of the institution. It requires the institution to demonstrate its fidelity to the purpose for which it exists.</w:t>
+      </w:r>
+    </w:p>
+    <w:p>
+      <w:bookmarkStart w:id="12" w:name="section_12"/>
+      <w:pPr>
+        <w:pStyle w:val="Heading1"/>
+      </w:pPr>
+      <w:r>
+        <w:t>12 Eschatology and the Openness of History</w:t>
+      </w:r>
+      <w:bookmarkEnd w:id="12"/>
+    </w:p>
+    <w:p>
+      <w:pPr>
+        <w:pStyle w:val="Heading2"/>
+      </w:pPr>
+      <w:r>
+        <w:t>The future as a ground of present action</w:t>
       </w:r>
     </w:p>
     <w:p>
@@ -1075,7 +1547,23 @@
         <w:rPr>
           <w:b w:val="0"/>
         </w:rPr>
-        <w:t>Yet the principle of a single ultimate ground is not equivalent to the full confession of the Trinity. In Volume II, the author explicitly limits its status to a structure of orientation. It may prepare a theological inquiry but does not replace it. A strong analysis must show at what stage specifically Christian content is introduced. [II, “The Genesis of Subjecthood”, §5.3.]</w:t>
+        <w:t>A person acts not only under the influence of the past. They relate the present to what does not yet exist: raising a child, founding an institution, keeping a promise. The future is present in action as a horizon, not as an already existing object.</w:t>
+      </w:r>
+    </w:p>
+    <w:p>
+      <w:r>
+        <w:rPr>
+          <w:b w:val="0"/>
+        </w:rPr>
+        <w:t>Eschatological subjecthood in CTM unfolds this structure in relation to ultimate fullness. It is not reducible to a forecast of final events. A person can assess the existing order from the perspective of what human existence is called to become. Historical success therefore does not automatically acquire the status of ultimate truth.</w:t>
+      </w:r>
+    </w:p>
+    <w:p>
+      <w:r>
+        <w:rPr>
+          <w:b w:val="0"/>
+        </w:rPr>
+        <w:t>The eschatological horizon performs a metaprojective function: it opens a space of possible models without dictating a single political or economic programme. Between the Ground and a concrete institution stand human interpretation, choice, resources, risk, and responsibility. Attributing unconditional divine authority to one's project means eliminating precisely these transitions. [II, “Eschatological Subjecthood”, §§1–8.]</w:t>
       </w:r>
     </w:p>
     <w:p>
@@ -1083,7 +1571,7 @@
         <w:pStyle w:val="Heading2"/>
       </w:pPr>
       <w:r>
-        <w:t>Idolatry as an error of grounding</w:t>
+        <w:t>Openness and false completion</w:t>
       </w:r>
     </w:p>
     <w:p>
@@ -1091,7 +1579,7 @@
         <w:rPr>
           <w:b w:val="0"/>
         </w:rPr>
-        <w:t>In CTM, an idol is not merely a cultic image. Idolatry arises when a finite object, model, or institution acquires the status of ultimate Reality. The person begins to protect it against every test and to subordinate other people to it.</w:t>
+        <w:t>Utopianism attempts to produce ultimate fullness by historical means. Apocalyptic paralysis, conversely, abandons action because it expects the end. Messianic narcissism assigns a person the role of indispensable saviour; eschatological inflation declares every event the final battle.</w:t>
       </w:r>
     </w:p>
     <w:p>
@@ -1099,7 +1587,7 @@
         <w:rPr>
           <w:b w:val="0"/>
         </w:rPr>
-        <w:t>This makes it possible to criticise idolatry within religiosity itself. Correctly naming the object of worship does not guarantee a right relationship. A person may say “God” while meaning the absolute confirmation of their own group. They may venerate truth while actually defending their own infallibility. Logocentricity is therefore determined by what a person acts from, not simply by the vocabulary of their self-description.</w:t>
+        <w:t>The common defect of these modes is the loss of the distinction between the ultimate horizon and a finite historical form. CTM preserves the right to act decisively without declaring one's action final. Corrigibility is not the absence of conviction; the limitations of a project do not cancel the obligation to carry it out if it is justified.</w:t>
       </w:r>
     </w:p>
     <w:p>
@@ -1107,25 +1595,57 @@
         <w:rPr>
           <w:b w:val="0"/>
         </w:rPr>
-        <w:t>Logofugality, correspondingly, means withdrawal from such verification and from connection with the Ground. It may be highly organised and technologically effective. The ordering of meaning is not identical with moral truth: a false project can also create discipline and stable procedures. Here the distinctions of the later volumes refine the sharper oppositions of the early philosophical part.</w:t>
-      </w:r>
-    </w:p>
-    <w:p>
-      <w:bookmarkStart w:id="8" w:name="section_8"/>
+        <w:t>History tests more than the quality of execution. Reality's resistance may reveal an error in the model itself or in the ordering of values. Fidelity to the Ground therefore sometimes requires changing a project originally understood as an expression of that fidelity.</w:t>
+      </w:r>
+    </w:p>
+    <w:p>
+      <w:pPr>
+        <w:pStyle w:val="Heading2"/>
+      </w:pPr>
+      <w:r>
+        <w:t>The eschaton is not an endless discussion</w:t>
+      </w:r>
+    </w:p>
+    <w:p>
+      <w:r>
+        <w:rPr>
+          <w:b w:val="0"/>
+        </w:rPr>
+        <w:t>In historical action, openness means the possibility of correction and refusal to sacralise finite forms. Yet in CTM the final eschaton is not reducible to eternal incompleteness. It includes the resurrection of the body, the transfiguration of creation, the Kingdom of God, and the fullness of communion.</w:t>
+      </w:r>
+    </w:p>
+    <w:p>
+      <w:r>
+        <w:rPr>
+          <w:b w:val="0"/>
+        </w:rPr>
+        <w:t>The formula of eternal ontological communication means participation in God's life with the preservation of the person and the distinction between Creator and creature. It does not mean an endless exchange of information. What rises is not merely the capacity to think: the person enters fullness in the entirety of created being.</w:t>
+      </w:r>
+    </w:p>
+    <w:p>
+      <w:r>
+        <w:rPr>
+          <w:b w:val="0"/>
+        </w:rPr>
+        <w:t>An overview that ends everything with the single word “openness” therefore loses the positive content of Christian hope. CTM joins the historical incompleteness of human constructions with the promise of a fullness the human being cannot produce through their own powers. [II, “Eschatological Subjecthood”, §§11–15.]</w:t>
+      </w:r>
+    </w:p>
+    <w:p>
+      <w:bookmarkStart w:id="13" w:name="section_13"/>
       <w:pPr>
         <w:pStyle w:val="Heading1"/>
       </w:pPr>
       <w:r>
-        <w:t>8 The Image of God and the Fullness of Personhood</w:t>
-      </w:r>
-      <w:bookmarkEnd w:id="8"/>
+        <w:t>13 The Trinitarian Ground and Pneumatology</w:t>
+      </w:r>
+      <w:bookmarkEnd w:id="13"/>
     </w:p>
     <w:p>
       <w:pPr>
         <w:pStyle w:val="Heading2"/>
       </w:pPr>
       <w:r>
-        <w:t>Individuality and irreplaceability</w:t>
+        <w:t>Why grace is not an additional module</w:t>
       </w:r>
     </w:p>
     <w:p>
@@ -1133,7 +1653,7 @@
         <w:rPr>
           <w:b w:val="0"/>
         </w:rPr>
-        <w:t>A person's biographical uniqueness does not in itself disclose what CTM seeks in personhood. A combination of causes can also be unique. The project asks a different question: why does this particular person have the right to a response of their own, and why can they not be replaced by a functionally equivalent performer?</w:t>
+        <w:t>“In Search of Pneumatology” begins with a lacuna acknowledged by the author. The architecture of human response had already been developed, but the place of the Holy Spirit and grace had received no dedicated explanation. The solution is not to add a fourth element to DIS, OS, and subjecthood, but to read the entire architecture theologically.</w:t>
       </w:r>
     </w:p>
     <w:p>
@@ -1141,7 +1661,7 @@
         <w:rPr>
           <w:b w:val="0"/>
         </w:rPr>
-        <w:t>The theological answer is developed through the image of God and likeness. Image denotes the possibility of personal response given to the human being; likeness denotes its unfolding towards the fullness of relationship with God. This is a working distinction within the architecture of response, not an exhaustive definition of every meaning of image and likeness in the Christian tradition. The pneumatology essay explicitly limits its subject in this way.</w:t>
+        <w:t>The argument here proceeds in one direction. The Trinity is not deduced from the fact that the anthropological model happens to have three dimensions. The project already proceeds from the Christian confession and examines whether independently introduced distinctions permit a more precise description of one aspect of the image of God.</w:t>
       </w:r>
     </w:p>
     <w:p>
@@ -1149,7 +1669,7 @@
         <w:rPr>
           <w:b w:val="0"/>
         </w:rPr>
-        <w:t>Human development does not create dignity out of nothing or make a less competent person less worthy of care. A crucial implication of CTM's eschatological part is that the value of a concrete person cannot be measured by their current productivity. The vocation to communion with God precedes assessment of the actual success of their response. This is particularly significant for understanding a child, a sick person, someone dependent on others, or a person with disabilities. This last application is an inference of the present analysis from the distinction between gift and actualisation, not a separate developed theory in the corpus. [III, §11; “In Search of Pneumatology”, §2; II, “Eschatological Subjecthood”, §§11–14.]</w:t>
+        <w:t>This is a fundamental limitation. An anthropological scheme does not prove a dogma; a dogmatic confession does not automatically make every proposed anthropological analogy true. The correspondence must demonstrate explanatory power and withstand negative verification. [III, “In Search of Pneumatology”, §§1–4.]</w:t>
       </w:r>
     </w:p>
     <w:p>
@@ -1157,7 +1677,7 @@
         <w:pStyle w:val="Heading2"/>
       </w:pPr>
       <w:r>
-        <w:t>Deification and the preservation of the human</w:t>
+        <w:t>Three correspondences and their asymmetry</w:t>
       </w:r>
     </w:p>
     <w:p>
@@ -1165,7 +1685,7 @@
         <w:rPr>
           <w:b w:val="0"/>
         </w:rPr>
-        <w:t>Within CTM's logic, deification means participation in God's life while preserving the distinction between Creator and creature. The human being neither becomes their own source nor disappears into an impersonal whole. On the contrary, the fullness of communion requires the preservation of the one who communes.</w:t>
+        <w:t>Subjecthood is correlated primarily with the paternal principle of beginning, authorship, and responsibility. The human being is not without beginning but can be a real derivative beginning of a response. This is not a degree of divinity; it distinguishes the received capacity from one's own performance of the act.</w:t>
       </w:r>
     </w:p>
     <w:p>
@@ -1173,7 +1693,7 @@
         <w:rPr>
           <w:b w:val="0"/>
         </w:rPr>
-        <w:t>Renouncing autonomous self-grounding is therefore not equivalent to renouncing personhood. The claim to be an absolute source is relinquished, while name, history, response, and responsibility remain. This is the fundamental difference between participation and absorption.</w:t>
+        <w:t>OS is correlated primarily with the filial, logos-related principle of differentiation and operation. The world is not absolutely undifferentiated chaos, and a human response can possess determinate meaning. Yet the logos-related dimension is broader than OS: it concerns both the determinacy of Reality itself and the structure of its presence.</w:t>
       </w:r>
     </w:p>
     <w:p>
@@ -1181,7 +1701,15 @@
         <w:rPr>
           <w:b w:val="0"/>
         </w:rPr>
-        <w:t>The formula “Christ bin”, which runs through Volume I, expresses the radical character of Christian self-determination: Christianity must become a way of existing rather than an external relationship to a revered model. It must be read through participation in Christ, not as a human appropriation of the unique hypostatic status of the incarnate Son. Volume II supports precisely this distinction: God enters the ontic sphere in Christ immediately and hypostatically; the human historical response is derivative and mediated. [I, “Towards an Ontology of the Logos”; “Faith as Competence”; II, “Eschatological Subjecthood”, §§6, 13.]</w:t>
+        <w:t>DIS is partially correlated with the pneumatological dimension through the structure of presence. Truth must not only be named correctly but become living and significant for the person, affect them, and become capable of changing their way of life. Intense presence does not, however, certify truth: fear, an idol, or a false picture can also occupy consciousness completely.</w:t>
+      </w:r>
+    </w:p>
+    <w:p>
+      <w:r>
+        <w:rPr>
+          <w:b w:val="0"/>
+        </w:rPr>
+        <w:t>These correspondences are deliberately asymmetrical. The pneumatological dimension runs through the entire architecture: openness, the enlivening of the relationship to truth, healing, and the passage from knowledge to actual response. It is not confined to DIS. Likewise, subjecthood is not the Father's exclusive sphere of action, nor are operations the Son's exclusive sphere. The action of the Trinity is one. [Ibid., §§3–15.]</w:t>
       </w:r>
     </w:p>
     <w:p>
@@ -1189,543 +1717,12 @@
         <w:pStyle w:val="Heading2"/>
       </w:pPr>
       <w:r>
-        <w:t>Absolute significance without absolute being</w:t>
-      </w:r>
-    </w:p>
-    <w:p>
-      <w:r>
-        <w:t>Volume II distinguishes God's absoluteness from the person's absolute significance for God. The human being is finite and created. But this finitude does not mean that the person is replaceable or may be sacrificed to an impersonal totality as expendable material.</w:t>
-      </w:r>
-    </w:p>
-    <w:p>
-      <w:r>
-        <w:rPr>
-          <w:b w:val="0"/>
-        </w:rPr>
-        <w:t>The Christian promise of eternal life concerns the concrete person, not merely the preservation of information about them, their social contribution, or a general human type. The question of personhood therefore acquires eschatological depth: what enables this very person to preserve their identity in definitive communion with God?</w:t>
-      </w:r>
-    </w:p>
-    <w:p>
-      <w:r>
-        <w:t>Within its Christian presuppositions, CTM here offers a theological grounding of irreplaceability. But the assertion that no other philosophical ground for irreplaceability is possible would be a separate, broader thesis. Showing the strength of the Christian solution is not enough to establish it: competing arguments must be considered. [II, “Eschatological Subjecthood”, §§11–12.]</w:t>
-      </w:r>
-    </w:p>
-    <w:p>
-      <w:bookmarkStart w:id="9" w:name="section_9"/>
-      <w:pPr>
-        <w:pStyle w:val="Heading1"/>
-      </w:pPr>
-      <w:r>
-        <w:t>9 Incarnation Cross and Resurrection</w:t>
-      </w:r>
-      <w:bookmarkEnd w:id="9"/>
-    </w:p>
-    <w:p>
-      <w:pPr>
-        <w:pStyle w:val="Heading2"/>
-      </w:pPr>
-      <w:r>
-        <w:t>God's initiative</w:t>
-      </w:r>
-    </w:p>
-    <w:p>
-      <w:r>
-        <w:rPr>
-          <w:b w:val="0"/>
-        </w:rPr>
-        <w:t>Presenting CTM solely as a ladder of human effort would substantially distort it. The person tests their grounds, suffers collapse, readdresses their life—and seemingly reaches God through their own effort. Volume II states the opposite clearly: the human movement towards God is grounded in God's prior movement towards the human being.</w:t>
-      </w:r>
-    </w:p>
-    <w:p>
-      <w:r>
-        <w:rPr>
-          <w:b w:val="0"/>
-        </w:rPr>
-        <w:t>The incarnation means that the Logos enters created reality, assuming human nature, body, and history. The Ground does not merely confront the human being with a demand from outside. In Christ, it becomes a participant in human vulnerability. The project's theology therefore cannot be exhausted by a universal technique for navigating between maps.</w:t>
-      </w:r>
-    </w:p>
-    <w:p>
-      <w:r>
-        <w:rPr>
-          <w:b w:val="0"/>
-        </w:rPr>
-        <w:t>This also limits a negative attitude towards the ontic. If the Son assumes body and history, the world's concreteness is not merely an obstacle to ascent towards meaning. It becomes a place of encounter and response. Work, bodily care, and the just ordering of relationships acquire significance as forms of historical embodiment, although none of them becomes the Kingdom of God itself. [II, “Eschatological Subjecthood”, §§6, 13–14.]</w:t>
-      </w:r>
-    </w:p>
-    <w:p>
-      <w:pPr>
-        <w:pStyle w:val="Heading2"/>
-      </w:pPr>
-      <w:r>
-        <w:t>The Cross as a test of the ground</w:t>
-      </w:r>
-    </w:p>
-    <w:p>
-      <w:r>
-        <w:t>The Cross occupies a central place in CTM because it separates fidelity to truth from a guarantee of one's own success. If a person regards as true only what preserves their strength, prestige, and safety, they continue to treat themselves as their ultimate ground. The practice of the Cross means the possibility of relinquishing this condition.</w:t>
-      </w:r>
-    </w:p>
-    <w:p>
-      <w:r>
-        <w:rPr>
-          <w:b w:val="0"/>
-        </w:rPr>
-        <w:t>Yet not every sacrifice becomes Christian. A person can die for a false project, under someone else's coercion, or for their own grandiosity. The magnitude of the loss does not prove the truth of its addressee. Christian discernment requires examining the relationship to truth, the other's freedom, responsibility, and Christ Himself.</w:t>
-      </w:r>
-    </w:p>
-    <w:p>
-      <w:r>
-        <w:rPr>
-          <w:b w:val="0"/>
-        </w:rPr>
-        <w:t>The practice of the Cross must therefore not be turned into a demand to expose oneself constantly to danger or to allow an institution to dispose of another person's suffering. In the terms of later CTM, whoever demands a cost must justify their right to demand it; voluntary ascetic discipline is not identical with the external dispossession of subjecthood. A theological formula does not dispense with this examination.</w:t>
-      </w:r>
-    </w:p>
-    <w:p>
-      <w:r>
-        <w:rPr>
-          <w:b w:val="0"/>
-        </w:rPr>
-        <w:t>Volume II gives the Cross an additional interpretation: God permits the actual consequences of human judgement upon Himself without recognising that judgement as true. Human freedom is so serious that its false response becomes a historical event. This theological reading by the author reveals the cost of relationship, but does not mean that a human verdict acquires power over God's ultimate truth. [I, “Faith as Competence”; II, “The Ontogenesis of Subjecthood”, §22; “Eschatological Subjecthood”, §13.]</w:t>
-      </w:r>
-    </w:p>
-    <w:p>
-      <w:pPr>
-        <w:pStyle w:val="Heading2"/>
-      </w:pPr>
-      <w:r>
-        <w:t>Why the argument is incomplete without the resurrection</w:t>
-      </w:r>
-    </w:p>
-    <w:p>
-      <w:r>
-        <w:rPr>
-          <w:b w:val="0"/>
-        </w:rPr>
-        <w:t>Stopping at the Cross as honesty in the face of defeat would yield a philosophy of dignity in catastrophe. CTM's Christian meaning is broader. The resurrection means that death and historical judgement do not constitute the final horizon of the human nature assumed by the Logos.</w:t>
-      </w:r>
-    </w:p>
-    <w:p>
-      <w:r>
-        <w:rPr>
-          <w:b w:val="0"/>
-        </w:rPr>
-        <w:t>Faith does not verbally turn defeat into victory. It relates the historical event to a promised fullness whose source is in God. The human capacity to withstand crisis neither produces the resurrection nor proves it empirically. The resurrection enters the project as the content of the Christian proclamation and the ground of hope.</w:t>
-      </w:r>
-    </w:p>
-    <w:p>
-      <w:r>
-        <w:rPr>
-          <w:b w:val="0"/>
-        </w:rPr>
-        <w:t>This distinction avoids two reductions. The first turns Christianity into heroic psychology: endure everything, and thereby save yourself. The second turns hope into a denial of consequences: since God will prevail, human error is insignificant. CTM requires both the reality of historical cost and openness to a horizon not exhausted by history.</w:t>
-      </w:r>
-    </w:p>
-    <w:p>
-      <w:bookmarkStart w:id="10" w:name="section_10"/>
-      <w:pPr>
-        <w:pStyle w:val="Heading1"/>
-      </w:pPr>
-      <w:r>
-        <w:t>10 Faith as Competence and the Language of God</w:t>
-      </w:r>
-      <w:bookmarkEnd w:id="10"/>
-    </w:p>
-    <w:p>
-      <w:pPr>
-        <w:pStyle w:val="Heading2"/>
-      </w:pPr>
-      <w:r>
-        <w:t>From conviction to the capacity to live</w:t>
-      </w:r>
-    </w:p>
-    <w:p>
-      <w:r>
-        <w:rPr>
-          <w:b w:val="0"/>
-        </w:rPr>
-        <w:t>In CTM, faith has psychological, social, and intellectual manifestations but is not exhausted by them. Experience, belonging, and conviction may be present in very different religious and ideological systems. The specifically Christian question concerns the source of life and the relationship to the future.</w:t>
-      </w:r>
-    </w:p>
-    <w:p>
-      <w:r>
-        <w:rPr>
-          <w:b w:val="0"/>
-        </w:rPr>
-        <w:t>Competence denotes a stable capacity to act where knowledge and instructions provide no ready-made solution. A person may know much about forgiveness and be unable to forgive; understand the necessity of truth and conceal it when threatened with loss. Between the content of consciousness and a way of existing there remains a transition that cannot be accomplished through a definition alone.</w:t>
-      </w:r>
-    </w:p>
-    <w:p>
-      <w:r>
-        <w:rPr>
-          <w:b w:val="0"/>
-        </w:rPr>
-        <w:t>Faith as competence is the capacity to maintain orientation towards God and truth under changing conditions, accept responsibility, examine one's own understanding, and renew one's response. It does not guarantee the rightness of every decision or make the believer omniscient. Its maturity includes the capacity to acknowledge error without destroying the relationship to the Ground itself. [I, “On the Nature of Faith”; “Faith as Competence”; III, Part XIII.]</w:t>
-      </w:r>
-    </w:p>
-    <w:p>
-      <w:pPr>
-        <w:pStyle w:val="Heading2"/>
-      </w:pPr>
-      <w:r>
-        <w:t>God's silence and the competitive world</w:t>
-      </w:r>
-    </w:p>
-    <w:p>
-      <w:r>
-        <w:rPr>
-          <w:b w:val="0"/>
-        </w:rPr>
-        <w:t>“The Language of God” in Volume I poses a painful question: how can confession of the God of Love be reconciled with the reality of suffering and the experience of His silence? This is not simply a chapter about sacred language or the logical structure of creation. It examines the discrepancy between the intervention a person expects and the transformation of the person themselves towards which Christianity is directed.</w:t>
-      </w:r>
-    </w:p>
-    <w:p>
-      <w:r>
-        <w:rPr>
-          <w:b w:val="0"/>
-        </w:rPr>
-        <w:t>Competitive ontology understands being through the struggle for preservation, superiority, and control. In such a world, even God may be conceived as the strongest participant, expected to secure victory for one's own side. Solidaric ontology presupposes another kind of relationship: the fullness of one should not be realised through the destruction of another. Humility here involves refusing to appropriate the centre of being, while purposiveness involves readiness to enter genuinely into a different relationship to life.</w:t>
-      </w:r>
-    </w:p>
-    <w:p>
-      <w:r>
-        <w:rPr>
-          <w:b w:val="0"/>
-        </w:rPr>
-        <w:t>This reading explains why Christianity is not obliged to confirm every human expectation of power. It does not, however, resolve every question of theodicy. The fact that coercive intervention may suppress freedom does not yet explain every instance of suffering, especially the suffering of those unable to accept it meaningfully. The chapter should therefore be read as an interpretation of the Christian way of responding, not presented as a completed proof that everything that happens is justified. [I, “The Language of God”.]</w:t>
-      </w:r>
-    </w:p>
-    <w:p>
-      <w:pPr>
-        <w:pStyle w:val="Heading2"/>
-      </w:pPr>
-      <w:r>
-        <w:t>Repentance and ascetic practice</w:t>
-      </w:r>
-    </w:p>
-    <w:p>
-      <w:r>
-        <w:rPr>
-          <w:b w:val="0"/>
-        </w:rPr>
-        <w:t>In CTM, repentance concerns the grounds of perception and action. A person not only regrets a transgression but examines what understanding of themselves and the world made it possible. If they still regard another person as a means to their own reassurance, an isolated apology may leave the recurrent structure of the relationship unchanged.</w:t>
-      </w:r>
-    </w:p>
-    <w:p>
-      <w:r>
-        <w:rPr>
-          <w:b w:val="0"/>
-        </w:rPr>
-        <w:t>Ontological asceticism denotes the discipline of relinquishing unsustainable elements of one's own map. This is a difficult capacity: a mistaken construction may sustain dignity, belonging, and familiar security. Relinquishing it requires not only an argument but also readiness to live differently.</w:t>
-      </w:r>
-    </w:p>
-    <w:p>
-      <w:r>
-        <w:rPr>
-          <w:b w:val="0"/>
-        </w:rPr>
-        <w:t>Constant examination does not, however, mean chronic psychological destabilisation. Stable habits, skills, and forms of life can support a response. What matters is their openness to correction, not the compulsory destruction of stability in every act. Here the later method permits a more careful reading of Volume I's language of continuous rupture.</w:t>
-      </w:r>
-    </w:p>
-    <w:p>
-      <w:bookmarkStart w:id="11" w:name="section_11"/>
-      <w:pPr>
-        <w:pStyle w:val="Heading1"/>
-      </w:pPr>
-      <w:r>
-        <w:t>11 The Church as Event and Historical Form</w:t>
-      </w:r>
-      <w:bookmarkEnd w:id="11"/>
-    </w:p>
-    <w:p>
-      <w:pPr>
-        <w:pStyle w:val="Heading2"/>
-      </w:pPr>
-      <w:r>
-        <w:t>Communion rather than mutual confirmation</w:t>
-      </w:r>
-    </w:p>
-    <w:p>
-      <w:r>
-        <w:t>Ontological communication begins where encountering the other can not only provide new information but also change the grounds of a person’s understanding. This requires recognising the interlocutor’s independent reality, which cannot be reduced to their place in one’s own picture of the world. The other’s response may disclose something that this map cannot accommodate.</w:t>
-      </w:r>
-    </w:p>
-    <w:p>
-      <w:r>
-        <w:rPr>
-          <w:b w:val="0"/>
-        </w:rPr>
-        <w:t>For CTM, this is essential in relation to both God and other human beings. Communion is not reducible to intensity of experience or agreement. Even conflict can become an event of encounter if its participants permit their grounds to be examined. Conversely, unanimity may result from the systematic exclusion of dissenters.</w:t>
-      </w:r>
-    </w:p>
-    <w:p>
-      <w:r>
-        <w:rPr>
-          <w:b w:val="0"/>
-        </w:rPr>
-        <w:t>The Church is considered as the space in which such communication should acquire a stable historical form. The theological meaning of the assembly and the Eucharist is connected with participation in the life of the Kingdom and the experience of communion not exhausted by the rules of the competitive world. Conversation does not replace the sacrament: the question concerns the human form of participation in God's action. [I, “The Starting Point: Once the Original”; “Essay”, chs. 6–7; II, “Eschatological Subjecthood”, §§9–10.]</w:t>
-      </w:r>
-    </w:p>
-    <w:p>
-      <w:pPr>
-        <w:pStyle w:val="Heading2"/>
-      </w:pPr>
-      <w:r>
-        <w:t>Why infrastructure is needed</w:t>
-      </w:r>
-    </w:p>
-    <w:p>
-      <w:r>
-        <w:rPr>
-          <w:b w:val="0"/>
-        </w:rPr>
-        <w:t>An individual event of encounter may prove impossible to transmit or reproduce. Historical form—worship, teaching, community, discipline, memory, and guidance—creates conditions in which a new person can enter the experience and develop a response of their own.</w:t>
-      </w:r>
-    </w:p>
-    <w:p>
-      <w:r>
-        <w:rPr>
-          <w:b w:val="0"/>
-        </w:rPr>
-        <w:t>The word “infrastructure” must therefore not imply that the Church is merely a service organisation. It isolates one aspect of the Church's historical existence: what makes the formation, support, verification, and reproduction of eschatological subjecthood possible. This is a functional perspective within a theological understanding, not an exhaustive dogmatic definition.</w:t>
-      </w:r>
-    </w:p>
-    <w:p>
-      <w:r>
-        <w:rPr>
-          <w:b w:val="0"/>
-        </w:rPr>
-        <w:t>An ecclesial form may fulfil its function, be in the process of acquiring it, compensate for the absence of a result, simulate that result, or produce the opposite effect. For example, guidance intended to teach discernment may consolidate an inability to decide without a guide. Such a diagnosis requires concrete evidence about practice; a critical tone alone is insufficient. [III, Part XIII; “In Search of Pneumatology”, §16.]</w:t>
-      </w:r>
-    </w:p>
-    <w:p>
-      <w:pPr>
-        <w:pStyle w:val="Heading2"/>
-      </w:pPr>
-      <w:r>
-        <w:t>Obedience and responsibility</w:t>
-      </w:r>
-    </w:p>
-    <w:p>
-      <w:r>
-        <w:rPr>
-          <w:b w:val="0"/>
-        </w:rPr>
-        <w:t>CTM makes it possible to put a rigorous question to obedience: does it enable a fuller personal response, or transfer authorship of the person's life to someone else? Outwardly similar actions may have different meanings. Voluntary acceptance of discipline can expand freedom; coercive suppression of objections can diminish it.</w:t>
-      </w:r>
-    </w:p>
-    <w:p>
-      <w:r>
-        <w:rPr>
-          <w:b w:val="0"/>
-        </w:rPr>
-        <w:t>The distinction cannot be established from the word “obedience” or the fact of restriction alone. One must determine whether verification, responsibility, the possibility of identifying a discrepancy, and recognition of the limits of the guide's authority are preserved. An institution cannot declare itself the ultimate addressee of readdressing and appropriate God's action.</w:t>
-      </w:r>
-    </w:p>
-    <w:p>
-      <w:r>
-        <w:t>One of CTM's central ecclesiological questions can therefore be formulated as follows: does ecclesial life produce people able to answer God themselves? Posing the question in this way does not require the rejection of the institution. It requires the institution to demonstrate its fidelity to the purpose for which it exists.</w:t>
-      </w:r>
-    </w:p>
-    <w:p>
-      <w:bookmarkStart w:id="12" w:name="section_12"/>
-      <w:pPr>
-        <w:pStyle w:val="Heading1"/>
-      </w:pPr>
-      <w:r>
-        <w:t>12 Eschatology and the Openness of History</w:t>
-      </w:r>
-      <w:bookmarkEnd w:id="12"/>
-    </w:p>
-    <w:p>
-      <w:pPr>
-        <w:pStyle w:val="Heading2"/>
-      </w:pPr>
-      <w:r>
-        <w:t>The future as a ground of present action</w:t>
-      </w:r>
-    </w:p>
-    <w:p>
-      <w:r>
-        <w:rPr>
-          <w:b w:val="0"/>
-        </w:rPr>
-        <w:t>A person acts not only under the influence of the past. They relate the present to what does not yet exist: raising a child, founding an institution, keeping a promise. The future is present in action as a horizon, not as an already existing object.</w:t>
-      </w:r>
-    </w:p>
-    <w:p>
-      <w:r>
-        <w:rPr>
-          <w:b w:val="0"/>
-        </w:rPr>
-        <w:t>Eschatological subjecthood in CTM unfolds this structure in relation to ultimate fullness. It is not reducible to a forecast of final events. A person can assess the existing order from the perspective of what human existence is called to become. Historical success therefore does not automatically acquire the status of ultimate truth.</w:t>
-      </w:r>
-    </w:p>
-    <w:p>
-      <w:r>
-        <w:rPr>
-          <w:b w:val="0"/>
-        </w:rPr>
-        <w:t>The eschatological horizon performs a metaprojective function: it opens a space of possible models without dictating a single political or economic programme. Between the Ground and a concrete institution stand human interpretation, choice, resources, risk, and responsibility. Attributing unconditional divine authority to one's project means eliminating precisely these transitions. [II, “Eschatological Subjecthood”, §§1–8.]</w:t>
-      </w:r>
-    </w:p>
-    <w:p>
-      <w:pPr>
-        <w:pStyle w:val="Heading2"/>
-      </w:pPr>
-      <w:r>
-        <w:t>Openness and false completion</w:t>
-      </w:r>
-    </w:p>
-    <w:p>
-      <w:r>
-        <w:rPr>
-          <w:b w:val="0"/>
-        </w:rPr>
-        <w:t>Utopianism attempts to produce ultimate fullness by historical means. Apocalyptic paralysis, conversely, abandons action because it expects the end. Messianic narcissism assigns a person the role of indispensable saviour; eschatological inflation declares every event the final battle.</w:t>
-      </w:r>
-    </w:p>
-    <w:p>
-      <w:r>
-        <w:rPr>
-          <w:b w:val="0"/>
-        </w:rPr>
-        <w:t>The common defect of these modes is the loss of the distinction between the ultimate horizon and a finite historical form. CTM preserves the right to act decisively without declaring one's action final. Corrigibility is not the absence of conviction; the limitations of a project do not cancel the obligation to carry it out if it is justified.</w:t>
-      </w:r>
-    </w:p>
-    <w:p>
-      <w:r>
-        <w:rPr>
-          <w:b w:val="0"/>
-        </w:rPr>
-        <w:t>History tests more than the quality of execution. Reality's resistance may reveal an error in the model itself or in the ordering of values. Fidelity to the Ground therefore sometimes requires changing a project originally understood as an expression of that fidelity.</w:t>
-      </w:r>
-    </w:p>
-    <w:p>
-      <w:pPr>
-        <w:pStyle w:val="Heading2"/>
-      </w:pPr>
-      <w:r>
-        <w:t>The eschaton is not an endless discussion</w:t>
-      </w:r>
-    </w:p>
-    <w:p>
-      <w:r>
-        <w:rPr>
-          <w:b w:val="0"/>
-        </w:rPr>
-        <w:t>In historical action, openness means the possibility of correction and refusal to sacralise finite forms. Yet in CTM the final eschaton is not reducible to eternal incompleteness. It includes the resurrection of the body, the transfiguration of creation, the Kingdom of God, and the fullness of communion.</w:t>
-      </w:r>
-    </w:p>
-    <w:p>
-      <w:r>
-        <w:rPr>
-          <w:b w:val="0"/>
-        </w:rPr>
-        <w:t>The formula of eternal ontological communication means participation in God's life with the preservation of the person and the distinction between Creator and creature. It does not mean an endless exchange of information. What rises is not merely the capacity to think: the person enters fullness in the entirety of created being.</w:t>
-      </w:r>
-    </w:p>
-    <w:p>
-      <w:r>
-        <w:rPr>
-          <w:b w:val="0"/>
-        </w:rPr>
-        <w:t>An overview that ends everything with the single word “openness” therefore loses the positive content of Christian hope. CTM joins the historical incompleteness of human constructions with the promise of a fullness the human being cannot produce through their own powers. [II, “Eschatological Subjecthood”, §§11–15.]</w:t>
-      </w:r>
-    </w:p>
-    <w:p>
-      <w:bookmarkStart w:id="13" w:name="section_13"/>
-      <w:pPr>
-        <w:pStyle w:val="Heading1"/>
-      </w:pPr>
-      <w:r>
-        <w:t>13 The Trinitarian Ground and Pneumatology</w:t>
-      </w:r>
-      <w:bookmarkEnd w:id="13"/>
-    </w:p>
-    <w:p>
-      <w:pPr>
-        <w:pStyle w:val="Heading2"/>
-      </w:pPr>
-      <w:r>
-        <w:t>Why grace is not an additional module</w:t>
-      </w:r>
-    </w:p>
-    <w:p>
-      <w:r>
-        <w:rPr>
-          <w:b w:val="0"/>
-        </w:rPr>
-        <w:t>“In Search of Pneumatology” begins with a lacuna acknowledged by the author. The architecture of human response had already been developed, but the place of the Holy Spirit and grace had received no dedicated explanation. The solution is not to add a fourth element to DIS, OS, and subjecthood, but to read the entire architecture theologically.</w:t>
-      </w:r>
-    </w:p>
-    <w:p>
-      <w:r>
-        <w:rPr>
-          <w:b w:val="0"/>
-        </w:rPr>
-        <w:t>The argument here proceeds in one direction. The Trinity is not deduced from the fact that the anthropological model happens to have three dimensions. The project already proceeds from the Christian confession and examines whether independently introduced distinctions permit a more precise description of one aspect of the image of God.</w:t>
-      </w:r>
-    </w:p>
-    <w:p>
-      <w:r>
-        <w:rPr>
-          <w:b w:val="0"/>
-        </w:rPr>
-        <w:t>This is a fundamental limitation. An anthropological scheme does not prove a dogma; a dogmatic confession does not automatically make every proposed anthropological analogy true. The correspondence must demonstrate explanatory power and withstand negative verification. [III, “In Search of Pneumatology”, §§1–4.]</w:t>
-      </w:r>
-    </w:p>
-    <w:p>
-      <w:pPr>
-        <w:pStyle w:val="Heading2"/>
-      </w:pPr>
-      <w:r>
-        <w:t>Three correspondences and their asymmetry</w:t>
-      </w:r>
-    </w:p>
-    <w:p>
-      <w:r>
-        <w:rPr>
-          <w:b w:val="0"/>
-        </w:rPr>
-        <w:t>Subjecthood is correlated primarily with the paternal principle of beginning, authorship, and responsibility. The human being is not without beginning but can be a real derivative beginning of a response. This is not a degree of divinity; it distinguishes the received capacity from one's own performance of the act.</w:t>
-      </w:r>
-    </w:p>
-    <w:p>
-      <w:r>
-        <w:rPr>
-          <w:b w:val="0"/>
-        </w:rPr>
-        <w:t>OS is correlated primarily with the filial, logos-related principle of differentiation and operation. The world is not absolutely undifferentiated chaos, and a human response can possess determinate meaning. Yet the logos-related dimension is broader than OS: it concerns both the determinacy of Reality itself and the structure of its presence.</w:t>
-      </w:r>
-    </w:p>
-    <w:p>
-      <w:r>
-        <w:rPr>
-          <w:b w:val="0"/>
-        </w:rPr>
-        <w:t>DIS is partially correlated with the pneumatological dimension through the structure of presence. Truth must not only be named correctly but become living and significant for the person, affect them, and become capable of changing their way of life. Intense presence does not, however, certify truth: fear, an idol, or a false picture can also occupy consciousness completely.</w:t>
-      </w:r>
-    </w:p>
-    <w:p>
-      <w:r>
-        <w:rPr>
-          <w:b w:val="0"/>
-        </w:rPr>
-        <w:t>These correspondences are deliberately asymmetrical. The pneumatological dimension runs through the entire architecture: openness, the enlivening of the relationship to truth, healing, and the passage from knowledge to actual response. It is not confined to DIS. Likewise, subjecthood is not the Father's exclusive sphere of action, nor are operations the Son's exclusive sphere. The action of the Trinity is one. [Ibid., §§3–15.]</w:t>
-      </w:r>
-    </w:p>
-    <w:p>
-      <w:pPr>
-        <w:pStyle w:val="Heading2"/>
-      </w:pPr>
-      <w:r>
         <w:t>Grace and the reality of human authorship</w:t>
       </w:r>
     </w:p>
     <w:p>
       <w:r>
-        <w:t>In CTM, grace is understood as a horizon bestowed by the Triune Personal God, within which freedom, humanity, and a person’s own response become possible. This formulation was clarified by the author in the preparation of the present exposition. By failing to recognise and appropriate the horizon of freedom and humanity bestowed by the Triune Personal God, a person risks losing the human (personal) subjecthood already attained. The basis for this clarification is found in the “Interpretative Condition” in CTM I: grace is presupposed as the condition of possibility of choice in all statements concerning choice and the subject’s capacity to adopt a particular position. Human authorship is therefore understood as exercised through the capacity to act that God grants and heals. God’s action must not be conceived as a competitor to human action: the healing of nature means a fuller human capacity to respond, not the disappearance of the author of the response. [CTM I, “Interpretative Condition”; CTM III, “In Search of Pneumatology”, §14.]</w:t>
+        <w:t>In CTM, grace is understood as a horizon bestowed by the Triune Personal God, within which freedom, being human in the personal sense, and a person’s own response become possible. This formulation was clarified by the author in the preparation of the present exposition. By failing to recognise and appropriate this bestowed horizon, a person risks losing the human (personal) subjecthood they have already attained. The basis for this clarification is found in the “Interpretative Condition” in CTM I: grace is presupposed as the condition of possibility of choice in all statements concerning choice and the subject’s capacity to adopt a particular position. Human authorship is therefore understood as exercised through the capacity to act that God grants and heals. God’s action must not be conceived as a competitor to human action: the healing of nature means a fuller human capacity to respond, not the disappearance of the author of the response. [CTM I, “Interpretative Condition”; CTM III, “In Search of Pneumatology”, §14.]</w:t>
       </w:r>
     </w:p>
     <w:p>

</xml_diff>